<commit_message>
docs: publish complete desktop user guide
</commit_message>
<xml_diff>
--- a/docs/새벽이슬_출석관리_사용설명서.docx
+++ b/docs/새벽이슬_출석관리_사용설명서.docx
@@ -50,7 +50,7 @@
         </w:rPr>
         <w:t>새벽이슬 청소년부</w:t>
         <w:br/>
-        <w:t>출석관리 사용설명서</w:t>
+        <w:t>출석관리 정식 사용설명서</w:t>
       </w:r>
     </w:p>
     <w:p>
@@ -64,7 +64,7 @@
           <w:color w:val="615A6B"/>
           <w:sz w:val="26"/>
         </w:rPr>
-        <w:t>크루교사 · 임원교사 · 보조교사를 위한 빠른 안내</w:t>
+        <w:t>크루교사 · 임원교사 · 보조교사를 위한 운영 안내</w:t>
       </w:r>
     </w:p>
     <w:tbl>
@@ -105,7 +105,7 @@
                 <w:color w:val="5B21B6"/>
                 <w:sz w:val="22"/>
               </w:rPr>
-              <w:t>한 문장으로</w:t>
+              <w:t>이 설명서의 목적</w:t>
             </w:r>
           </w:p>
           <w:p>
@@ -118,7 +118,7 @@
                 <w:color w:val="21172E"/>
                 <w:sz w:val="20"/>
               </w:rPr>
-              <w:t>휴대폰에서는 빠르게 출석을 체크하고, 컴퓨터에서는 전체 현황과 보고사항을 한눈에 관리하는 청소년부 공용 시스템입니다.</w:t>
+              <w:t>처음 사용하는 교사도 화면에 적힌 순서대로 출석을 체크하고, 임원은 컴퓨터에서 전체 기록과 보고사항을 안전하게 관리할 수 있도록 안내합니다.</w:t>
             </w:r>
           </w:p>
         </w:tc>
@@ -131,6 +131,19 @@
     </w:p>
     <w:p>
       <w:pPr>
+        <w:spacing w:after="40" w:line="300" w:lineRule="auto"/>
+        <w:jc w:val="center"/>
+      </w:pPr>
+      <w:r>
+        <w:rPr>
+          <w:rFonts w:ascii="Malgun Gothic" w:hAnsi="Malgun Gothic" w:eastAsia="Malgun Gothic"/>
+          <w:color w:val="615A6B"/>
+        </w:rPr>
+        <w:t>운영용 · 2026년 7월</w:t>
+      </w:r>
+    </w:p>
+    <w:p>
+      <w:pPr>
         <w:spacing w:after="0" w:line="300" w:lineRule="auto"/>
         <w:jc w:val="center"/>
       </w:pPr>
@@ -139,7 +152,7 @@
           <w:rFonts w:ascii="Malgun Gothic" w:hAnsi="Malgun Gothic" w:eastAsia="Malgun Gothic"/>
           <w:color w:val="615A6B"/>
         </w:rPr>
-        <w:t>초안 검토용 · 2026년 7월</w:t>
+        <w:t>운영 주소  https://changhyun-leek.github.io/crew-attendance/</w:t>
       </w:r>
     </w:p>
     <w:p>
@@ -158,20 +171,83 @@
           <w:color w:val="5B21B6"/>
           <w:sz w:val="32"/>
         </w:rPr>
-        <w:t>1. 시스템 한눈에 보기</w:t>
+        <w:t>1. 10분 안에 시작하기</w:t>
       </w:r>
+    </w:p>
+    <w:tbl>
+      <w:tblPr>
+        <w:tblW w:type="dxa" w:w="9360"/>
+        <w:jc w:val="left"/>
+        <w:tblLayout w:type="fixed"/>
+        <w:tblLook w:firstColumn="1" w:firstRow="1" w:lastColumn="0" w:lastRow="0" w:noHBand="0" w:noVBand="1" w:val="04A0"/>
+        <w:tblInd w:w="120" w:type="dxa"/>
+      </w:tblPr>
+      <w:tblGrid>
+        <w:gridCol w:w="9360"/>
+      </w:tblGrid>
+      <w:tr>
+        <w:trPr>
+          <w:tblHeader w:val="true"/>
+        </w:trPr>
+        <w:tc>
+          <w:tcPr>
+            <w:tcW w:type="dxa" w:w="9360"/>
+            <w:tcMar>
+              <w:top w:w="80" w:type="dxa"/>
+              <w:start w:w="120" w:type="dxa"/>
+              <w:bottom w:w="80" w:type="dxa"/>
+              <w:end w:w="120" w:type="dxa"/>
+            </w:tcMar>
+            <w:vAlign w:val="center"/>
+            <w:shd w:fill="F1EAFE"/>
+          </w:tcPr>
+          <w:p>
+            <w:pPr>
+              <w:spacing w:after="80"/>
+            </w:pPr>
+            <w:r>
+              <w:rPr>
+                <w:rFonts w:ascii="Malgun Gothic" w:hAnsi="Malgun Gothic" w:eastAsia="Malgun Gothic"/>
+                <w:b/>
+                <w:color w:val="5B21B6"/>
+                <w:sz w:val="22"/>
+              </w:rPr>
+              <w:t>가장 쉬운 시작</w:t>
+            </w:r>
+          </w:p>
+          <w:p>
+            <w:pPr>
+              <w:spacing w:after="0" w:line="288" w:lineRule="auto"/>
+            </w:pPr>
+            <w:r>
+              <w:rPr>
+                <w:rFonts w:ascii="Malgun Gothic" w:hAnsi="Malgun Gothic" w:eastAsia="Malgun Gothic"/>
+                <w:color w:val="21172E"/>
+                <w:sz w:val="20"/>
+              </w:rPr>
+              <w:t>데스크톱의 새벽이슬 출석관리 바로가기를 더블클릭합니다. 설명서와 관리 파일은 새벽이슬 출석관리 안내 폴더에서 엽니다. 휴대폰에서는 운영 주소를 즐겨찾기 또는 홈 화면에 추가합니다.</w:t>
+            </w:r>
+          </w:p>
+        </w:tc>
+      </w:tr>
+    </w:tbl>
+    <w:p>
+      <w:pPr>
+        <w:spacing w:after="20"/>
+      </w:pPr>
     </w:p>
     <w:p>
       <w:pPr>
-        <w:spacing w:after="120" w:line="300" w:lineRule="auto"/>
-        <w:jc w:val="left"/>
+        <w:pStyle w:val="Heading2"/>
       </w:pPr>
       <w:r>
         <w:rPr>
           <w:rFonts w:ascii="Malgun Gothic" w:hAnsi="Malgun Gothic" w:eastAsia="Malgun Gothic"/>
-          <w:color w:val="21172E"/>
+          <w:b/>
+          <w:color w:val="5B21B6"/>
+          <w:sz w:val="26"/>
         </w:rPr>
-        <w:t>사이트 첫 화면에서 본인의 역할을 선택하면 필요한 기능만 보이도록 구성되어 있습니다. 글자와 버튼을 크게 배치해 휴대폰에 익숙하지 않은 사용자도 순서대로 누르면 사용할 수 있습니다.</w:t>
+        <w:t>첫 화면에서 역할 선택</w:t>
       </w:r>
     </w:p>
     <w:tbl>
@@ -440,6 +516,116 @@
                 <w:color w:val="21172E"/>
                 <w:sz w:val="18"/>
               </w:rPr>
+              <w:t>임원교사</w:t>
+            </w:r>
+          </w:p>
+        </w:tc>
+        <w:tc>
+          <w:tcPr>
+            <w:tcW w:type="dxa" w:w="1440"/>
+            <w:tcMar>
+              <w:top w:w="80" w:type="dxa"/>
+              <w:start w:w="120" w:type="dxa"/>
+              <w:bottom w:w="80" w:type="dxa"/>
+              <w:end w:w="120" w:type="dxa"/>
+            </w:tcMar>
+            <w:vAlign w:val="center"/>
+          </w:tcPr>
+          <w:p>
+            <w:pPr>
+              <w:spacing w:before="0" w:after="0" w:line="276" w:lineRule="auto"/>
+              <w:jc w:val="left"/>
+            </w:pPr>
+            <w:r>
+              <w:rPr>
+                <w:rFonts w:ascii="Malgun Gothic" w:hAnsi="Malgun Gothic" w:eastAsia="Malgun Gothic"/>
+                <w:b w:val="0"/>
+                <w:color w:val="21172E"/>
+                <w:sz w:val="18"/>
+              </w:rPr>
+              <w:t>컴퓨터</w:t>
+            </w:r>
+          </w:p>
+        </w:tc>
+        <w:tc>
+          <w:tcPr>
+            <w:tcW w:type="dxa" w:w="4140"/>
+            <w:tcMar>
+              <w:top w:w="80" w:type="dxa"/>
+              <w:start w:w="120" w:type="dxa"/>
+              <w:bottom w:w="80" w:type="dxa"/>
+              <w:end w:w="120" w:type="dxa"/>
+            </w:tcMar>
+            <w:vAlign w:val="center"/>
+          </w:tcPr>
+          <w:p>
+            <w:pPr>
+              <w:spacing w:before="0" w:after="0" w:line="276" w:lineRule="auto"/>
+              <w:jc w:val="left"/>
+            </w:pPr>
+            <w:r>
+              <w:rPr>
+                <w:rFonts w:ascii="Malgun Gothic" w:hAnsi="Malgun Gothic" w:eastAsia="Malgun Gothic"/>
+                <w:b w:val="0"/>
+                <w:color w:val="21172E"/>
+                <w:sz w:val="18"/>
+              </w:rPr>
+              <w:t>전체 출석, 공지, 임시 조사, 교사·크루·학생 관리</w:t>
+            </w:r>
+          </w:p>
+        </w:tc>
+        <w:tc>
+          <w:tcPr>
+            <w:tcW w:type="dxa" w:w="2340"/>
+            <w:tcMar>
+              <w:top w:w="80" w:type="dxa"/>
+              <w:start w:w="120" w:type="dxa"/>
+              <w:bottom w:w="80" w:type="dxa"/>
+              <w:end w:w="120" w:type="dxa"/>
+            </w:tcMar>
+            <w:vAlign w:val="center"/>
+          </w:tcPr>
+          <w:p>
+            <w:pPr>
+              <w:spacing w:before="0" w:after="0" w:line="276" w:lineRule="auto"/>
+              <w:jc w:val="left"/>
+            </w:pPr>
+            <w:r>
+              <w:rPr>
+                <w:rFonts w:ascii="Malgun Gothic" w:hAnsi="Malgun Gothic" w:eastAsia="Malgun Gothic"/>
+                <w:b w:val="0"/>
+                <w:color w:val="21172E"/>
+                <w:sz w:val="18"/>
+              </w:rPr>
+              <w:t>임원 PIN 필요</w:t>
+            </w:r>
+          </w:p>
+        </w:tc>
+      </w:tr>
+      <w:tr>
+        <w:tc>
+          <w:tcPr>
+            <w:tcW w:type="dxa" w:w="1440"/>
+            <w:tcMar>
+              <w:top w:w="80" w:type="dxa"/>
+              <w:start w:w="120" w:type="dxa"/>
+              <w:bottom w:w="80" w:type="dxa"/>
+              <w:end w:w="120" w:type="dxa"/>
+            </w:tcMar>
+            <w:vAlign w:val="center"/>
+          </w:tcPr>
+          <w:p>
+            <w:pPr>
+              <w:spacing w:before="0" w:after="0" w:line="276" w:lineRule="auto"/>
+              <w:jc w:val="left"/>
+            </w:pPr>
+            <w:r>
+              <w:rPr>
+                <w:rFonts w:ascii="Malgun Gothic" w:hAnsi="Malgun Gothic" w:eastAsia="Malgun Gothic"/>
+                <w:b w:val="0"/>
+                <w:color w:val="21172E"/>
+                <w:sz w:val="18"/>
+              </w:rPr>
               <w:t>보조교사</w:t>
             </w:r>
           </w:p>
@@ -526,116 +712,6 @@
           </w:p>
         </w:tc>
       </w:tr>
-      <w:tr>
-        <w:tc>
-          <w:tcPr>
-            <w:tcW w:type="dxa" w:w="1440"/>
-            <w:tcMar>
-              <w:top w:w="80" w:type="dxa"/>
-              <w:start w:w="120" w:type="dxa"/>
-              <w:bottom w:w="80" w:type="dxa"/>
-              <w:end w:w="120" w:type="dxa"/>
-            </w:tcMar>
-            <w:vAlign w:val="center"/>
-          </w:tcPr>
-          <w:p>
-            <w:pPr>
-              <w:spacing w:before="0" w:after="0" w:line="276" w:lineRule="auto"/>
-              <w:jc w:val="left"/>
-            </w:pPr>
-            <w:r>
-              <w:rPr>
-                <w:rFonts w:ascii="Malgun Gothic" w:hAnsi="Malgun Gothic" w:eastAsia="Malgun Gothic"/>
-                <w:b w:val="0"/>
-                <w:color w:val="21172E"/>
-                <w:sz w:val="18"/>
-              </w:rPr>
-              <w:t>임원교사</w:t>
-            </w:r>
-          </w:p>
-        </w:tc>
-        <w:tc>
-          <w:tcPr>
-            <w:tcW w:type="dxa" w:w="1440"/>
-            <w:tcMar>
-              <w:top w:w="80" w:type="dxa"/>
-              <w:start w:w="120" w:type="dxa"/>
-              <w:bottom w:w="80" w:type="dxa"/>
-              <w:end w:w="120" w:type="dxa"/>
-            </w:tcMar>
-            <w:vAlign w:val="center"/>
-          </w:tcPr>
-          <w:p>
-            <w:pPr>
-              <w:spacing w:before="0" w:after="0" w:line="276" w:lineRule="auto"/>
-              <w:jc w:val="left"/>
-            </w:pPr>
-            <w:r>
-              <w:rPr>
-                <w:rFonts w:ascii="Malgun Gothic" w:hAnsi="Malgun Gothic" w:eastAsia="Malgun Gothic"/>
-                <w:b w:val="0"/>
-                <w:color w:val="21172E"/>
-                <w:sz w:val="18"/>
-              </w:rPr>
-              <w:t>컴퓨터</w:t>
-            </w:r>
-          </w:p>
-        </w:tc>
-        <w:tc>
-          <w:tcPr>
-            <w:tcW w:type="dxa" w:w="4140"/>
-            <w:tcMar>
-              <w:top w:w="80" w:type="dxa"/>
-              <w:start w:w="120" w:type="dxa"/>
-              <w:bottom w:w="80" w:type="dxa"/>
-              <w:end w:w="120" w:type="dxa"/>
-            </w:tcMar>
-            <w:vAlign w:val="center"/>
-          </w:tcPr>
-          <w:p>
-            <w:pPr>
-              <w:spacing w:before="0" w:after="0" w:line="276" w:lineRule="auto"/>
-              <w:jc w:val="left"/>
-            </w:pPr>
-            <w:r>
-              <w:rPr>
-                <w:rFonts w:ascii="Malgun Gothic" w:hAnsi="Malgun Gothic" w:eastAsia="Malgun Gothic"/>
-                <w:b w:val="0"/>
-                <w:color w:val="21172E"/>
-                <w:sz w:val="18"/>
-              </w:rPr>
-              <w:t>전체 출석, 공지, 임시 조사, 교사·크루·학생 관리</w:t>
-            </w:r>
-          </w:p>
-        </w:tc>
-        <w:tc>
-          <w:tcPr>
-            <w:tcW w:type="dxa" w:w="2340"/>
-            <w:tcMar>
-              <w:top w:w="80" w:type="dxa"/>
-              <w:start w:w="120" w:type="dxa"/>
-              <w:bottom w:w="80" w:type="dxa"/>
-              <w:end w:w="120" w:type="dxa"/>
-            </w:tcMar>
-            <w:vAlign w:val="center"/>
-          </w:tcPr>
-          <w:p>
-            <w:pPr>
-              <w:spacing w:before="0" w:after="0" w:line="276" w:lineRule="auto"/>
-              <w:jc w:val="left"/>
-            </w:pPr>
-            <w:r>
-              <w:rPr>
-                <w:rFonts w:ascii="Malgun Gothic" w:hAnsi="Malgun Gothic" w:eastAsia="Malgun Gothic"/>
-                <w:b w:val="0"/>
-                <w:color w:val="21172E"/>
-                <w:sz w:val="18"/>
-              </w:rPr>
-              <w:t>임원 PIN 필요</w:t>
-            </w:r>
-          </w:p>
-        </w:tc>
-      </w:tr>
     </w:tbl>
     <w:p>
       <w:pPr>
@@ -653,7 +729,7 @@
           <w:color w:val="5B21B6"/>
           <w:sz w:val="26"/>
         </w:rPr>
-        <w:t>처음 접속할 때</w:t>
+        <w:t>처음 접속하는 순서</w:t>
       </w:r>
     </w:p>
     <w:p>
@@ -669,7 +745,7 @@
           <w:rFonts w:ascii="Malgun Gothic" w:hAnsi="Malgun Gothic" w:eastAsia="Malgun Gothic"/>
           <w:color w:val="21172E"/>
         </w:rPr>
-        <w:t>첫 화면에서 크루교사, 임원교사, 보조교사 중 하나를 누릅니다.</w:t>
+        <w:t>크루교사, 임원교사, 보조교사 중 본인의 역할을 누릅니다.</w:t>
       </w:r>
     </w:p>
     <w:p>
@@ -701,7 +777,7 @@
           <w:rFonts w:ascii="Malgun Gothic" w:hAnsi="Malgun Gothic" w:eastAsia="Malgun Gothic"/>
           <w:color w:val="21172E"/>
         </w:rPr>
-        <w:t>숫자 PIN 4~6자리를 입력합니다. 개인 기기에서는 로그인이 최대 30일 유지됩니다.</w:t>
+        <w:t>숫자 PIN 4~6자리를 입력하고 확인 표시를 누릅니다.</w:t>
       </w:r>
     </w:p>
     <w:p>
@@ -717,7 +793,186 @@
           <w:rFonts w:ascii="Malgun Gothic" w:hAnsi="Malgun Gothic" w:eastAsia="Malgun Gothic"/>
           <w:color w:val="21172E"/>
         </w:rPr>
-        <w:t>공용 기기에서는 사용 후 반드시 로그아웃합니다.</w:t>
+        <w:t>개인 기기에서는 로그인이 최대 30일 유지됩니다. 공용 기기에서는 사용 후 반드시 로그아웃합니다.</w:t>
+      </w:r>
+    </w:p>
+    <w:p>
+      <w:pPr>
+        <w:spacing w:after="0" w:line="300" w:lineRule="auto"/>
+        <w:jc w:val="left"/>
+      </w:pPr>
+      <w:r>
+        <w:rPr>
+          <w:rFonts w:ascii="Malgun Gothic" w:hAnsi="Malgun Gothic" w:eastAsia="Malgun Gothic"/>
+          <w:b/>
+          <w:color w:val="615A6B"/>
+        </w:rPr>
+        <w:t>빠른 찾기</w:t>
+      </w:r>
+      <w:r>
+        <w:rPr>
+          <w:rFonts w:ascii="Malgun Gothic" w:hAnsi="Malgun Gothic" w:eastAsia="Malgun Gothic"/>
+          <w:color w:val="615A6B"/>
+        </w:rPr>
+        <w:t xml:space="preserve">  |  크루교사 2장 · 보조교사 3장 · 임원 4~6장 · 보안·오류 7~8장 · 데스크톱·수정 9장</w:t>
+      </w:r>
+    </w:p>
+    <w:p>
+      <w:r>
+        <w:br w:type="page"/>
+      </w:r>
+    </w:p>
+    <w:p>
+      <w:pPr>
+        <w:pStyle w:val="Heading1"/>
+      </w:pPr>
+      <w:r>
+        <w:rPr>
+          <w:rFonts w:ascii="Malgun Gothic" w:hAnsi="Malgun Gothic" w:eastAsia="Malgun Gothic"/>
+          <w:b/>
+          <w:color w:val="5B21B6"/>
+          <w:sz w:val="32"/>
+        </w:rPr>
+        <w:t>2. 크루교사 출석체크</w:t>
+      </w:r>
+    </w:p>
+    <w:p>
+      <w:pPr>
+        <w:spacing w:after="120" w:line="300" w:lineRule="auto"/>
+        <w:jc w:val="left"/>
+      </w:pPr>
+      <w:r>
+        <w:rPr>
+          <w:rFonts w:ascii="Malgun Gothic" w:hAnsi="Malgun Gothic" w:eastAsia="Malgun Gothic"/>
+          <w:color w:val="21172E"/>
+        </w:rPr>
+        <w:t>크루교사 화면은 휴대폰에서 한 손으로 사용할 수 있도록 학생 이름과 큰 출석·결석 버튼을 한 줄에 배치했습니다.</w:t>
+      </w:r>
+    </w:p>
+    <w:p>
+      <w:pPr>
+        <w:pStyle w:val="Heading2"/>
+      </w:pPr>
+      <w:r>
+        <w:rPr>
+          <w:rFonts w:ascii="Malgun Gothic" w:hAnsi="Malgun Gothic" w:eastAsia="Malgun Gothic"/>
+          <w:b/>
+          <w:color w:val="5B21B6"/>
+          <w:sz w:val="26"/>
+        </w:rPr>
+        <w:t>출석을 시작하는 순서</w:t>
+      </w:r>
+    </w:p>
+    <w:p>
+      <w:pPr>
+        <w:numPr>
+          <w:ilvl w:val="0"/>
+          <w:numId w:val="10"/>
+        </w:numPr>
+        <w:spacing w:after="80" w:line="300" w:lineRule="auto"/>
+      </w:pPr>
+      <w:r>
+        <w:rPr>
+          <w:rFonts w:ascii="Malgun Gothic" w:hAnsi="Malgun Gothic" w:eastAsia="Malgun Gothic"/>
+          <w:color w:val="21172E"/>
+        </w:rPr>
+        <w:t>첫 화면에서 크루교사를 누릅니다.</w:t>
+      </w:r>
+    </w:p>
+    <w:p>
+      <w:pPr>
+        <w:numPr>
+          <w:ilvl w:val="0"/>
+          <w:numId w:val="10"/>
+        </w:numPr>
+        <w:spacing w:after="80" w:line="300" w:lineRule="auto"/>
+      </w:pPr>
+      <w:r>
+        <w:rPr>
+          <w:rFonts w:ascii="Malgun Gothic" w:hAnsi="Malgun Gothic" w:eastAsia="Malgun Gothic"/>
+          <w:color w:val="21172E"/>
+        </w:rPr>
+        <w:t>이름을 직접 누르거나 이름 검색에 이름 일부를 입력합니다.</w:t>
+      </w:r>
+    </w:p>
+    <w:p>
+      <w:pPr>
+        <w:numPr>
+          <w:ilvl w:val="0"/>
+          <w:numId w:val="10"/>
+        </w:numPr>
+        <w:spacing w:after="80" w:line="300" w:lineRule="auto"/>
+      </w:pPr>
+      <w:r>
+        <w:rPr>
+          <w:rFonts w:ascii="Malgun Gothic" w:hAnsi="Malgun Gothic" w:eastAsia="Malgun Gothic"/>
+          <w:color w:val="21172E"/>
+        </w:rPr>
+        <w:t>PIN을 입력한 뒤 화면 상단의 날짜와 크루명을 확인합니다.</w:t>
+      </w:r>
+    </w:p>
+    <w:p>
+      <w:pPr>
+        <w:numPr>
+          <w:ilvl w:val="0"/>
+          <w:numId w:val="10"/>
+        </w:numPr>
+        <w:spacing w:after="80" w:line="300" w:lineRule="auto"/>
+      </w:pPr>
+      <w:r>
+        <w:rPr>
+          <w:rFonts w:ascii="Malgun Gothic" w:hAnsi="Malgun Gothic" w:eastAsia="Malgun Gothic"/>
+          <w:color w:val="21172E"/>
+        </w:rPr>
+        <w:t>학생마다 출석 또는 결석을 누릅니다. 같은 상태를 다시 누르면 미체크로 돌아갑니다.</w:t>
+      </w:r>
+    </w:p>
+    <w:p>
+      <w:pPr>
+        <w:numPr>
+          <w:ilvl w:val="0"/>
+          <w:numId w:val="10"/>
+        </w:numPr>
+        <w:spacing w:after="80" w:line="300" w:lineRule="auto"/>
+      </w:pPr>
+      <w:r>
+        <w:rPr>
+          <w:rFonts w:ascii="Malgun Gothic" w:hAnsi="Malgun Gothic" w:eastAsia="Malgun Gothic"/>
+          <w:color w:val="21172E"/>
+        </w:rPr>
+        <w:t>결석 이유나 연락 결과가 있으면 사유·비고를 누르고 내용을 저장합니다.</w:t>
+      </w:r>
+    </w:p>
+    <w:p>
+      <w:pPr>
+        <w:numPr>
+          <w:ilvl w:val="0"/>
+          <w:numId w:val="10"/>
+        </w:numPr>
+        <w:spacing w:after="80" w:line="300" w:lineRule="auto"/>
+      </w:pPr>
+      <w:r>
+        <w:rPr>
+          <w:rFonts w:ascii="Malgun Gothic" w:hAnsi="Malgun Gothic" w:eastAsia="Malgun Gothic"/>
+          <w:color w:val="21172E"/>
+        </w:rPr>
+        <w:t>임원이 만든 임시 항목이 보이면 학생별 값을 선택합니다.</w:t>
+      </w:r>
+    </w:p>
+    <w:p>
+      <w:pPr>
+        <w:numPr>
+          <w:ilvl w:val="0"/>
+          <w:numId w:val="10"/>
+        </w:numPr>
+        <w:spacing w:after="80" w:line="300" w:lineRule="auto"/>
+      </w:pPr>
+      <w:r>
+        <w:rPr>
+          <w:rFonts w:ascii="Malgun Gothic" w:hAnsi="Malgun Gothic" w:eastAsia="Malgun Gothic"/>
+          <w:color w:val="21172E"/>
+        </w:rPr>
+        <w:t>미체크가 0명인지 확인하고 보고 문구 복사를 사용합니다.</w:t>
       </w:r>
     </w:p>
     <w:tbl>
@@ -758,7 +1013,7 @@
                 <w:color w:val="B7791F"/>
                 <w:sz w:val="22"/>
               </w:rPr>
-              <w:t>보안 안내</w:t>
+              <w:t>저장 완료 확인</w:t>
             </w:r>
           </w:p>
           <w:p>
@@ -771,7 +1026,7 @@
                 <w:color w:val="21172E"/>
                 <w:sz w:val="20"/>
               </w:rPr>
-              <w:t>교사 PIN은 브라우저 코드나 일반 데이터 표에 저장되지 않습니다. PIN을 5회 연속 잘못 입력하면 해당 계정은 10분간 잠깁니다.</w:t>
+              <w:t>학생별 표시가 저장 중에서 저장됨으로 바뀌었는지 확인합니다. 인터넷 연결 경고 또는 저장 실패가 보이면 저장된 것으로 판단하지 않습니다.</w:t>
             </w:r>
           </w:p>
         </w:tc>
@@ -781,6 +1036,84 @@
       <w:pPr>
         <w:spacing w:after="20"/>
       </w:pPr>
+    </w:p>
+    <w:p>
+      <w:pPr>
+        <w:pStyle w:val="Heading2"/>
+      </w:pPr>
+      <w:r>
+        <w:rPr>
+          <w:rFonts w:ascii="Malgun Gothic" w:hAnsi="Malgun Gothic" w:eastAsia="Malgun Gothic"/>
+          <w:b/>
+          <w:color w:val="5B21B6"/>
+          <w:sz w:val="26"/>
+        </w:rPr>
+        <w:t>학생 추가와 상태 관리</w:t>
+      </w:r>
+    </w:p>
+    <w:p>
+      <w:pPr>
+        <w:numPr>
+          <w:ilvl w:val="0"/>
+          <w:numId w:val="11"/>
+        </w:numPr>
+        <w:spacing w:after="80" w:line="300" w:lineRule="auto"/>
+      </w:pPr>
+      <w:r>
+        <w:rPr>
+          <w:rFonts w:ascii="Malgun Gothic" w:hAnsi="Malgun Gothic" w:eastAsia="Malgun Gothic"/>
+          <w:color w:val="21172E"/>
+        </w:rPr>
+        <w:t>새 학생은 학생 관리에서 이름을 입력해 추가합니다.</w:t>
+      </w:r>
+    </w:p>
+    <w:p>
+      <w:pPr>
+        <w:numPr>
+          <w:ilvl w:val="0"/>
+          <w:numId w:val="11"/>
+        </w:numPr>
+        <w:spacing w:after="80" w:line="300" w:lineRule="auto"/>
+      </w:pPr>
+      <w:r>
+        <w:rPr>
+          <w:rFonts w:ascii="Malgun Gothic" w:hAnsi="Malgun Gothic" w:eastAsia="Malgun Gothic"/>
+          <w:color w:val="21172E"/>
+        </w:rPr>
+        <w:t>오래 나오지 못하는 학생은 장기결석으로 바꾸고, 복귀하면 활동으로 되돌립니다.</w:t>
+      </w:r>
+    </w:p>
+    <w:p>
+      <w:pPr>
+        <w:numPr>
+          <w:ilvl w:val="0"/>
+          <w:numId w:val="11"/>
+        </w:numPr>
+        <w:spacing w:after="80" w:line="300" w:lineRule="auto"/>
+      </w:pPr>
+      <w:r>
+        <w:rPr>
+          <w:rFonts w:ascii="Malgun Gothic" w:hAnsi="Malgun Gothic" w:eastAsia="Malgun Gothic"/>
+          <w:color w:val="21172E"/>
+        </w:rPr>
+        <w:t>더 이상 크루에 속하지 않는 학생은 삭제하지 않고 퇴실로 처리합니다.</w:t>
+      </w:r>
+    </w:p>
+    <w:p>
+      <w:pPr>
+        <w:numPr>
+          <w:ilvl w:val="0"/>
+          <w:numId w:val="11"/>
+        </w:numPr>
+        <w:spacing w:after="80" w:line="300" w:lineRule="auto"/>
+      </w:pPr>
+      <w:r>
+        <w:rPr>
+          <w:rFonts w:ascii="Malgun Gothic" w:hAnsi="Malgun Gothic" w:eastAsia="Malgun Gothic"/>
+          <w:color w:val="21172E"/>
+        </w:rPr>
+        <w:t>학생 상태가 바뀌어도 과거 출석 기록은 그대로 유지됩니다.</w:t>
+      </w:r>
     </w:p>
     <w:p>
       <w:r>
@@ -798,7 +1131,7 @@
           <w:color w:val="5B21B6"/>
           <w:sz w:val="32"/>
         </w:rPr>
-        <w:t>2. 크루교사와 보조교사 출석체크</w:t>
+        <w:t>3. 보조교사와 학생 보고사항</w:t>
       </w:r>
     </w:p>
     <w:p>
@@ -812,7 +1145,20 @@
           <w:color w:val="5B21B6"/>
           <w:sz w:val="26"/>
         </w:rPr>
-        <w:t>크루교사</w:t>
+        <w:t>보조교사 출석체크</w:t>
+      </w:r>
+    </w:p>
+    <w:p>
+      <w:pPr>
+        <w:spacing w:after="120" w:line="300" w:lineRule="auto"/>
+        <w:jc w:val="left"/>
+      </w:pPr>
+      <w:r>
+        <w:rPr>
+          <w:rFonts w:ascii="Malgun Gothic" w:hAnsi="Malgun Gothic" w:eastAsia="Malgun Gothic"/>
+          <w:color w:val="21172E"/>
+        </w:rPr>
+        <w:t>보조교사는 개인 계정 없이 본인 이름을 입력하고 선택한 크루의 오늘 출석만 체크합니다. 화면 상단에는 현재 입력한 보조교사 이름이 표시됩니다.</w:t>
       </w:r>
     </w:p>
     <w:p>
@@ -828,7 +1174,7 @@
           <w:rFonts w:ascii="Malgun Gothic" w:hAnsi="Malgun Gothic" w:eastAsia="Malgun Gothic"/>
           <w:color w:val="21172E"/>
         </w:rPr>
-        <w:t>출석 날짜와 크루명을 확인합니다.</w:t>
+        <w:t>첫 화면에서 보조교사를 누르고 출석할 크루를 선택합니다.</w:t>
       </w:r>
     </w:p>
     <w:p>
@@ -844,7 +1190,7 @@
           <w:rFonts w:ascii="Malgun Gothic" w:hAnsi="Malgun Gothic" w:eastAsia="Malgun Gothic"/>
           <w:color w:val="21172E"/>
         </w:rPr>
-        <w:t>학생별로 큰 출석 또는 결석 버튼을 누릅니다. 같은 버튼을 다시 누르면 미체크로 돌아갑니다.</w:t>
+        <w:t>최근 사용 이름을 고르거나 본인 이름을 두 글자 이상 입력합니다.</w:t>
       </w:r>
     </w:p>
     <w:p>
@@ -860,7 +1206,7 @@
           <w:rFonts w:ascii="Malgun Gothic" w:hAnsi="Malgun Gothic" w:eastAsia="Malgun Gothic"/>
           <w:color w:val="21172E"/>
         </w:rPr>
-        <w:t>결석 이유나 연락 상태가 있으면 학생의 사유·비고 버튼을 누릅니다.</w:t>
+        <w:t>오늘 출석·결석, 당일 결석 사유, 연락 상태, 임시 확인 항목을 입력합니다.</w:t>
       </w:r>
     </w:p>
     <w:p>
@@ -876,98 +1222,7 @@
           <w:rFonts w:ascii="Malgun Gothic" w:hAnsi="Malgun Gothic" w:eastAsia="Malgun Gothic"/>
           <w:color w:val="21172E"/>
         </w:rPr>
-        <w:t>임원이 요청한 임시 항목이 보이면 학생과 확인한 값을 선택합니다.</w:t>
-      </w:r>
-    </w:p>
-    <w:p>
-      <w:pPr>
-        <w:numPr>
-          <w:ilvl w:val="0"/>
-          <w:numId w:val="10"/>
-        </w:numPr>
-        <w:spacing w:after="80" w:line="300" w:lineRule="auto"/>
-      </w:pPr>
-      <w:r>
-        <w:rPr>
-          <w:rFonts w:ascii="Malgun Gothic" w:hAnsi="Malgun Gothic" w:eastAsia="Malgun Gothic"/>
-          <w:color w:val="21172E"/>
-        </w:rPr>
-        <w:t>마지막으로 미체크 인원을 확인하고 보고 문구 복사를 눌러 단톡방 보고에 사용합니다.</w:t>
-      </w:r>
-    </w:p>
-    <w:p>
-      <w:pPr>
-        <w:pStyle w:val="Heading2"/>
-      </w:pPr>
-      <w:r>
-        <w:rPr>
-          <w:rFonts w:ascii="Malgun Gothic" w:hAnsi="Malgun Gothic" w:eastAsia="Malgun Gothic"/>
-          <w:b/>
-          <w:color w:val="5B21B6"/>
-          <w:sz w:val="26"/>
-        </w:rPr>
-        <w:t>보조교사</w:t>
-      </w:r>
-    </w:p>
-    <w:p>
-      <w:pPr>
-        <w:spacing w:after="120" w:line="300" w:lineRule="auto"/>
-        <w:jc w:val="left"/>
-      </w:pPr>
-      <w:r>
-        <w:rPr>
-          <w:rFonts w:ascii="Malgun Gothic" w:hAnsi="Malgun Gothic" w:eastAsia="Malgun Gothic"/>
-          <w:color w:val="21172E"/>
-        </w:rPr>
-        <w:t>보조교사는 계정 없이 본인 이름을 입력하고 선택한 크루의 오늘 출석만 체크합니다. 화면 상단에는 현재 보조교사 이름이 항상 표시됩니다.</w:t>
-      </w:r>
-    </w:p>
-    <w:p>
-      <w:pPr>
-        <w:numPr>
-          <w:ilvl w:val="0"/>
-          <w:numId w:val="11"/>
-        </w:numPr>
-        <w:spacing w:after="80" w:line="300" w:lineRule="auto"/>
-      </w:pPr>
-      <w:r>
-        <w:rPr>
-          <w:rFonts w:ascii="Malgun Gothic" w:hAnsi="Malgun Gothic" w:eastAsia="Malgun Gothic"/>
-          <w:color w:val="21172E"/>
-        </w:rPr>
-        <w:t>최근 사용 이름을 고르거나 새 이름을 직접 입력합니다.</w:t>
-      </w:r>
-    </w:p>
-    <w:p>
-      <w:pPr>
-        <w:numPr>
-          <w:ilvl w:val="0"/>
-          <w:numId w:val="11"/>
-        </w:numPr>
-        <w:spacing w:after="80" w:line="300" w:lineRule="auto"/>
-      </w:pPr>
-      <w:r>
-        <w:rPr>
-          <w:rFonts w:ascii="Malgun Gothic" w:hAnsi="Malgun Gothic" w:eastAsia="Malgun Gothic"/>
-          <w:color w:val="21172E"/>
-        </w:rPr>
-        <w:t>오늘 출석·결석, 결석 사유, 연락 상태, 임시 확인 항목만 수정합니다.</w:t>
-      </w:r>
-    </w:p>
-    <w:p>
-      <w:pPr>
-        <w:numPr>
-          <w:ilvl w:val="0"/>
-          <w:numId w:val="11"/>
-        </w:numPr>
-        <w:spacing w:after="80" w:line="300" w:lineRule="auto"/>
-      </w:pPr>
-      <w:r>
-        <w:rPr>
-          <w:rFonts w:ascii="Malgun Gothic" w:hAnsi="Malgun Gothic" w:eastAsia="Malgun Gothic"/>
-          <w:color w:val="21172E"/>
-        </w:rPr>
-        <w:t>이름을 잘못 입력하면 상단 이름을 눌러 수정합니다. 이전 이름과 수정 이름은 변경 이력에 함께 남습니다.</w:t>
+        <w:t>이름이 잘못되었으면 화면 상단 이름에서 수정합니다. 이전 이름과 수정 이름은 변경 기록에 남습니다.</w:t>
       </w:r>
     </w:p>
     <w:tbl>
@@ -995,7 +1250,7 @@
               <w:end w:w="120" w:type="dxa"/>
             </w:tcMar>
             <w:vAlign w:val="center"/>
-            <w:shd w:fill="FFF8E6"/>
+            <w:shd w:fill="F1EAFE"/>
           </w:tcPr>
           <w:p>
             <w:pPr>
@@ -1005,10 +1260,10 @@
               <w:rPr>
                 <w:rFonts w:ascii="Malgun Gothic" w:hAnsi="Malgun Gothic" w:eastAsia="Malgun Gothic"/>
                 <w:b/>
-                <w:color w:val="B7791F"/>
+                <w:color w:val="5B21B6"/>
                 <w:sz w:val="22"/>
               </w:rPr>
-              <w:t>저장 상태 확인</w:t>
+              <w:t>보조교사 권한</w:t>
             </w:r>
           </w:p>
           <w:p>
@@ -1021,7 +1276,7 @@
                 <w:color w:val="21172E"/>
                 <w:sz w:val="20"/>
               </w:rPr>
-              <w:t>저장 중 → 저장됨 표시를 확인합니다. 인터넷 연결 경고나 저장 실패가 보이면 연결이 복구될 때까지 저장 완료로 판단하지 않습니다.</w:t>
+              <w:t>과거 출석, 지속 학생 비고, 학생 관리, 다른 크루 자료와 내보내기 기능에는 접근할 수 없습니다.</w:t>
             </w:r>
           </w:p>
         </w:tc>
@@ -1033,35 +1288,17 @@
       </w:pPr>
     </w:p>
     <w:p>
-      <w:r>
-        <w:br w:type="page"/>
-      </w:r>
-    </w:p>
-    <w:p>
       <w:pPr>
-        <w:pStyle w:val="Heading1"/>
+        <w:pStyle w:val="Heading2"/>
       </w:pPr>
       <w:r>
         <w:rPr>
           <w:rFonts w:ascii="Malgun Gothic" w:hAnsi="Malgun Gothic" w:eastAsia="Malgun Gothic"/>
           <w:b/>
           <w:color w:val="5B21B6"/>
-          <w:sz w:val="32"/>
+          <w:sz w:val="26"/>
         </w:rPr>
-        <w:t>3. 사유·비고와 임원 요청사항</w:t>
-      </w:r>
-    </w:p>
-    <w:p>
-      <w:pPr>
-        <w:spacing w:after="120" w:line="300" w:lineRule="auto"/>
-        <w:jc w:val="left"/>
-      </w:pPr>
-      <w:r>
-        <w:rPr>
-          <w:rFonts w:ascii="Malgun Gothic" w:hAnsi="Malgun Gothic" w:eastAsia="Malgun Gothic"/>
-          <w:color w:val="21172E"/>
-        </w:rPr>
-        <w:t>학생 관련 내용은 성격에 따라 구분해 기록하면 임원이 필요한 일을 놓치지 않고, 당일 사유와 장기 확인사항이 섞이지 않습니다.</w:t>
+        <w:t>사유와 비고를 구분하는 기준</w:t>
       </w:r>
     </w:p>
     <w:tbl>
@@ -1643,6 +1880,38 @@
       </w:pPr>
     </w:p>
     <w:p>
+      <w:r>
+        <w:br w:type="page"/>
+      </w:r>
+    </w:p>
+    <w:p>
+      <w:pPr>
+        <w:pStyle w:val="Heading1"/>
+      </w:pPr>
+      <w:r>
+        <w:rPr>
+          <w:rFonts w:ascii="Malgun Gothic" w:hAnsi="Malgun Gothic" w:eastAsia="Malgun Gothic"/>
+          <w:b/>
+          <w:color w:val="5B21B6"/>
+          <w:sz w:val="32"/>
+        </w:rPr>
+        <w:t>4. 임원교사 전체 현황과 내보내기</w:t>
+      </w:r>
+    </w:p>
+    <w:p>
+      <w:pPr>
+        <w:spacing w:after="120" w:line="300" w:lineRule="auto"/>
+        <w:jc w:val="left"/>
+      </w:pPr>
+      <w:r>
+        <w:rPr>
+          <w:rFonts w:ascii="Malgun Gothic" w:hAnsi="Malgun Gothic" w:eastAsia="Malgun Gothic"/>
+          <w:color w:val="21172E"/>
+        </w:rPr>
+        <w:t>임원 화면은 컴퓨터 사용을 기준으로 왼쪽 메뉴, 상단 필터, 중앙 데이터 표를 배치했습니다. 태블릿과 휴대폰에서는 메뉴가 접히지만 대량 확인과 내보내기는 컴퓨터 사용을 권장합니다.</w:t>
+      </w:r>
+    </w:p>
+    <w:p>
       <w:pPr>
         <w:pStyle w:val="Heading2"/>
       </w:pPr>
@@ -1653,7 +1922,7 @@
           <w:color w:val="5B21B6"/>
           <w:sz w:val="26"/>
         </w:rPr>
-        <w:t>임원 공지와 임시 칸</w:t>
+        <w:t>전체 출석을 확인하는 순서</w:t>
       </w:r>
     </w:p>
     <w:p>
@@ -1669,7 +1938,7 @@
           <w:rFonts w:ascii="Malgun Gothic" w:hAnsi="Malgun Gothic" w:eastAsia="Malgun Gothic"/>
           <w:color w:val="21172E"/>
         </w:rPr>
-        <w:t>임원 화면에서 공지·임시 항목 메뉴를 엽니다.</w:t>
+        <w:t>첫 화면에서 임원교사를 누르고 임원 이름과 PIN으로 로그인합니다.</w:t>
       </w:r>
     </w:p>
     <w:p>
@@ -1685,7 +1954,7 @@
           <w:rFonts w:ascii="Malgun Gothic" w:hAnsi="Malgun Gothic" w:eastAsia="Malgun Gothic"/>
           <w:color w:val="21172E"/>
         </w:rPr>
-        <w:t>공지 또는 학생별 임시 확인 칸을 선택합니다.</w:t>
+        <w:t>전체 현황에서 운영 크루, 등록 학생, 출석, 결석과 출석률을 확인합니다.</w:t>
       </w:r>
     </w:p>
     <w:p>
@@ -1701,7 +1970,7 @@
           <w:rFonts w:ascii="Malgun Gothic" w:hAnsi="Malgun Gothic" w:eastAsia="Malgun Gothic"/>
           <w:color w:val="21172E"/>
         </w:rPr>
-        <w:t>제목, 설명, 게시 시작일과 종료일을 입력합니다.</w:t>
+        <w:t>시작일, 종료일, 크루, 학생, 상태, 비고 필터를 필요한 만큼 설정합니다.</w:t>
       </w:r>
     </w:p>
     <w:p>
@@ -1717,7 +1986,7 @@
           <w:rFonts w:ascii="Malgun Gothic" w:hAnsi="Malgun Gothic" w:eastAsia="Malgun Gothic"/>
           <w:color w:val="21172E"/>
         </w:rPr>
-        <w:t>임시 칸은 쉼표로 선택지를 적습니다. 예: 신청, 미신청, 고려중.</w:t>
+        <w:t>조회를 눌러 표를 갱신합니다.</w:t>
       </w:r>
     </w:p>
     <w:p>
@@ -1733,7 +2002,7 @@
           <w:rFonts w:ascii="Malgun Gothic" w:hAnsi="Malgun Gothic" w:eastAsia="Malgun Gothic"/>
           <w:color w:val="21172E"/>
         </w:rPr>
-        <w:t>게시 기간이 끝나면 출석 화면에서는 자동으로 숨겨지고 기존 응답은 보존됩니다.</w:t>
+        <w:t>노란색 행과 확인 필요 표식이 있는 학생의 사유·연락·비고를 확인합니다.</w:t>
       </w:r>
     </w:p>
     <w:tbl>
@@ -1774,7 +2043,7 @@
                 <w:color w:val="5B21B6"/>
                 <w:sz w:val="22"/>
               </w:rPr>
-              <w:t>비고 학생 구분</w:t>
+              <w:t>확인 필요 학생</w:t>
             </w:r>
           </w:p>
           <w:p>
@@ -1787,455 +2056,7 @@
                 <w:color w:val="21172E"/>
                 <w:sz w:val="20"/>
               </w:rPr>
-              <w:t>임원 출석표에서 사유, 연락 안 됨 또는 학생 비고가 있는 학생은 노란색 행과 확인 필요 표식으로 바로 구분됩니다.</w:t>
-            </w:r>
-          </w:p>
-        </w:tc>
-      </w:tr>
-    </w:tbl>
-    <w:p>
-      <w:pPr>
-        <w:spacing w:after="20"/>
-      </w:pPr>
-    </w:p>
-    <w:p>
-      <w:r>
-        <w:br w:type="page"/>
-      </w:r>
-    </w:p>
-    <w:p>
-      <w:pPr>
-        <w:pStyle w:val="Heading1"/>
-      </w:pPr>
-      <w:r>
-        <w:rPr>
-          <w:rFonts w:ascii="Malgun Gothic" w:hAnsi="Malgun Gothic" w:eastAsia="Malgun Gothic"/>
-          <w:b/>
-          <w:color w:val="5B21B6"/>
-          <w:sz w:val="32"/>
-        </w:rPr>
-        <w:t>4. 임원교사 관리 화면</w:t>
-      </w:r>
-    </w:p>
-    <w:p>
-      <w:pPr>
-        <w:spacing w:after="120" w:line="300" w:lineRule="auto"/>
-        <w:jc w:val="left"/>
-      </w:pPr>
-      <w:r>
-        <w:rPr>
-          <w:rFonts w:ascii="Malgun Gothic" w:hAnsi="Malgun Gothic" w:eastAsia="Malgun Gothic"/>
-          <w:color w:val="21172E"/>
-        </w:rPr>
-        <w:t>임원 화면은 컴퓨터 사용을 기준으로 왼쪽 메뉴, 상단 필터, 중앙 데이터 표를 배치했습니다. 태블릿과 휴대폰에서는 메뉴가 접히지만 대량 확인과 내보내기는 컴퓨터 사용을 권장합니다.</w:t>
-      </w:r>
-    </w:p>
-    <w:tbl>
-      <w:tblPr>
-        <w:tblStyle w:val="TableGrid"/>
-        <w:tblW w:type="dxa" w:w="9360"/>
-        <w:tblLayout w:type="fixed"/>
-        <w:tblLook w:firstColumn="1" w:firstRow="1" w:lastColumn="0" w:lastRow="0" w:noHBand="0" w:noVBand="1" w:val="04A0"/>
-        <w:jc w:val="left"/>
-        <w:tblInd w:w="120" w:type="dxa"/>
-      </w:tblPr>
-      <w:tblGrid>
-        <w:gridCol w:w="2700"/>
-        <w:gridCol w:w="6660"/>
-      </w:tblGrid>
-      <w:tr>
-        <w:trPr>
-          <w:tblHeader w:val="true"/>
-        </w:trPr>
-        <w:tc>
-          <w:tcPr>
-            <w:tcW w:type="dxa" w:w="2700"/>
-            <w:tcMar>
-              <w:top w:w="80" w:type="dxa"/>
-              <w:start w:w="120" w:type="dxa"/>
-              <w:bottom w:w="80" w:type="dxa"/>
-              <w:end w:w="120" w:type="dxa"/>
-            </w:tcMar>
-            <w:vAlign w:val="center"/>
-            <w:shd w:fill="E8EEF5"/>
-          </w:tcPr>
-          <w:p>
-            <w:pPr>
-              <w:spacing w:before="0" w:after="0" w:line="276" w:lineRule="auto"/>
-              <w:jc w:val="left"/>
-            </w:pPr>
-            <w:r>
-              <w:rPr>
-                <w:rFonts w:ascii="Malgun Gothic" w:hAnsi="Malgun Gothic" w:eastAsia="Malgun Gothic"/>
-                <w:b/>
-                <w:color w:val="3B0764"/>
-                <w:sz w:val="18"/>
-              </w:rPr>
-              <w:t>메뉴</w:t>
-            </w:r>
-          </w:p>
-        </w:tc>
-        <w:tc>
-          <w:tcPr>
-            <w:tcW w:type="dxa" w:w="6660"/>
-            <w:tcMar>
-              <w:top w:w="80" w:type="dxa"/>
-              <w:start w:w="120" w:type="dxa"/>
-              <w:bottom w:w="80" w:type="dxa"/>
-              <w:end w:w="120" w:type="dxa"/>
-            </w:tcMar>
-            <w:vAlign w:val="center"/>
-            <w:shd w:fill="E8EEF5"/>
-          </w:tcPr>
-          <w:p>
-            <w:pPr>
-              <w:spacing w:before="0" w:after="0" w:line="276" w:lineRule="auto"/>
-              <w:jc w:val="left"/>
-            </w:pPr>
-            <w:r>
-              <w:rPr>
-                <w:rFonts w:ascii="Malgun Gothic" w:hAnsi="Malgun Gothic" w:eastAsia="Malgun Gothic"/>
-                <w:b/>
-                <w:color w:val="3B0764"/>
-                <w:sz w:val="18"/>
-              </w:rPr>
-              <w:t>주요 기능</w:t>
-            </w:r>
-          </w:p>
-        </w:tc>
-      </w:tr>
-      <w:tr>
-        <w:tc>
-          <w:tcPr>
-            <w:tcW w:type="dxa" w:w="2700"/>
-            <w:tcMar>
-              <w:top w:w="80" w:type="dxa"/>
-              <w:start w:w="120" w:type="dxa"/>
-              <w:bottom w:w="80" w:type="dxa"/>
-              <w:end w:w="120" w:type="dxa"/>
-            </w:tcMar>
-            <w:vAlign w:val="center"/>
-          </w:tcPr>
-          <w:p>
-            <w:pPr>
-              <w:spacing w:before="0" w:after="0" w:line="276" w:lineRule="auto"/>
-              <w:jc w:val="left"/>
-            </w:pPr>
-            <w:r>
-              <w:rPr>
-                <w:rFonts w:ascii="Malgun Gothic" w:hAnsi="Malgun Gothic" w:eastAsia="Malgun Gothic"/>
-                <w:b w:val="0"/>
-                <w:color w:val="21172E"/>
-                <w:sz w:val="18"/>
-              </w:rPr>
-              <w:t>전체 현황</w:t>
-            </w:r>
-          </w:p>
-        </w:tc>
-        <w:tc>
-          <w:tcPr>
-            <w:tcW w:type="dxa" w:w="6660"/>
-            <w:tcMar>
-              <w:top w:w="80" w:type="dxa"/>
-              <w:start w:w="120" w:type="dxa"/>
-              <w:bottom w:w="80" w:type="dxa"/>
-              <w:end w:w="120" w:type="dxa"/>
-            </w:tcMar>
-            <w:vAlign w:val="center"/>
-          </w:tcPr>
-          <w:p>
-            <w:pPr>
-              <w:spacing w:before="0" w:after="0" w:line="276" w:lineRule="auto"/>
-              <w:jc w:val="left"/>
-            </w:pPr>
-            <w:r>
-              <w:rPr>
-                <w:rFonts w:ascii="Malgun Gothic" w:hAnsi="Malgun Gothic" w:eastAsia="Malgun Gothic"/>
-                <w:b w:val="0"/>
-                <w:color w:val="21172E"/>
-                <w:sz w:val="18"/>
-              </w:rPr>
-              <w:t>크루 수, 학생 수, 출석·결석, 출석률 요약</w:t>
-            </w:r>
-          </w:p>
-        </w:tc>
-      </w:tr>
-      <w:tr>
-        <w:tc>
-          <w:tcPr>
-            <w:tcW w:type="dxa" w:w="2700"/>
-            <w:tcMar>
-              <w:top w:w="80" w:type="dxa"/>
-              <w:start w:w="120" w:type="dxa"/>
-              <w:bottom w:w="80" w:type="dxa"/>
-              <w:end w:w="120" w:type="dxa"/>
-            </w:tcMar>
-            <w:vAlign w:val="center"/>
-          </w:tcPr>
-          <w:p>
-            <w:pPr>
-              <w:spacing w:before="0" w:after="0" w:line="276" w:lineRule="auto"/>
-              <w:jc w:val="left"/>
-            </w:pPr>
-            <w:r>
-              <w:rPr>
-                <w:rFonts w:ascii="Malgun Gothic" w:hAnsi="Malgun Gothic" w:eastAsia="Malgun Gothic"/>
-                <w:b w:val="0"/>
-                <w:color w:val="21172E"/>
-                <w:sz w:val="18"/>
-              </w:rPr>
-              <w:t>출석 기록</w:t>
-            </w:r>
-          </w:p>
-        </w:tc>
-        <w:tc>
-          <w:tcPr>
-            <w:tcW w:type="dxa" w:w="6660"/>
-            <w:tcMar>
-              <w:top w:w="80" w:type="dxa"/>
-              <w:start w:w="120" w:type="dxa"/>
-              <w:bottom w:w="80" w:type="dxa"/>
-              <w:end w:w="120" w:type="dxa"/>
-            </w:tcMar>
-            <w:vAlign w:val="center"/>
-          </w:tcPr>
-          <w:p>
-            <w:pPr>
-              <w:spacing w:before="0" w:after="0" w:line="276" w:lineRule="auto"/>
-              <w:jc w:val="left"/>
-            </w:pPr>
-            <w:r>
-              <w:rPr>
-                <w:rFonts w:ascii="Malgun Gothic" w:hAnsi="Malgun Gothic" w:eastAsia="Malgun Gothic"/>
-                <w:b w:val="0"/>
-                <w:color w:val="21172E"/>
-                <w:sz w:val="18"/>
-              </w:rPr>
-              <w:t>날짜·크루·학생·상태·비고별 검색과 상세 확인</w:t>
-            </w:r>
-          </w:p>
-        </w:tc>
-      </w:tr>
-      <w:tr>
-        <w:tc>
-          <w:tcPr>
-            <w:tcW w:type="dxa" w:w="2700"/>
-            <w:tcMar>
-              <w:top w:w="80" w:type="dxa"/>
-              <w:start w:w="120" w:type="dxa"/>
-              <w:bottom w:w="80" w:type="dxa"/>
-              <w:end w:w="120" w:type="dxa"/>
-            </w:tcMar>
-            <w:vAlign w:val="center"/>
-          </w:tcPr>
-          <w:p>
-            <w:pPr>
-              <w:spacing w:before="0" w:after="0" w:line="276" w:lineRule="auto"/>
-              <w:jc w:val="left"/>
-            </w:pPr>
-            <w:r>
-              <w:rPr>
-                <w:rFonts w:ascii="Malgun Gothic" w:hAnsi="Malgun Gothic" w:eastAsia="Malgun Gothic"/>
-                <w:b w:val="0"/>
-                <w:color w:val="21172E"/>
-                <w:sz w:val="18"/>
-              </w:rPr>
-              <w:t>공지·임시 항목</w:t>
-            </w:r>
-          </w:p>
-        </w:tc>
-        <w:tc>
-          <w:tcPr>
-            <w:tcW w:type="dxa" w:w="6660"/>
-            <w:tcMar>
-              <w:top w:w="80" w:type="dxa"/>
-              <w:start w:w="120" w:type="dxa"/>
-              <w:bottom w:w="80" w:type="dxa"/>
-              <w:end w:w="120" w:type="dxa"/>
-            </w:tcMar>
-            <w:vAlign w:val="center"/>
-          </w:tcPr>
-          <w:p>
-            <w:pPr>
-              <w:spacing w:before="0" w:after="0" w:line="276" w:lineRule="auto"/>
-              <w:jc w:val="left"/>
-            </w:pPr>
-            <w:r>
-              <w:rPr>
-                <w:rFonts w:ascii="Malgun Gothic" w:hAnsi="Malgun Gothic" w:eastAsia="Malgun Gothic"/>
-                <w:b w:val="0"/>
-                <w:color w:val="21172E"/>
-                <w:sz w:val="18"/>
-              </w:rPr>
-              <w:t>교사 공지와 기간 한정 학생별 조사 생성</w:t>
-            </w:r>
-          </w:p>
-        </w:tc>
-      </w:tr>
-      <w:tr>
-        <w:tc>
-          <w:tcPr>
-            <w:tcW w:type="dxa" w:w="2700"/>
-            <w:tcMar>
-              <w:top w:w="80" w:type="dxa"/>
-              <w:start w:w="120" w:type="dxa"/>
-              <w:bottom w:w="80" w:type="dxa"/>
-              <w:end w:w="120" w:type="dxa"/>
-            </w:tcMar>
-            <w:vAlign w:val="center"/>
-          </w:tcPr>
-          <w:p>
-            <w:pPr>
-              <w:spacing w:before="0" w:after="0" w:line="276" w:lineRule="auto"/>
-              <w:jc w:val="left"/>
-            </w:pPr>
-            <w:r>
-              <w:rPr>
-                <w:rFonts w:ascii="Malgun Gothic" w:hAnsi="Malgun Gothic" w:eastAsia="Malgun Gothic"/>
-                <w:b w:val="0"/>
-                <w:color w:val="21172E"/>
-                <w:sz w:val="18"/>
-              </w:rPr>
-              <w:t>오류·개선 의견</w:t>
-            </w:r>
-          </w:p>
-        </w:tc>
-        <w:tc>
-          <w:tcPr>
-            <w:tcW w:type="dxa" w:w="6660"/>
-            <w:tcMar>
-              <w:top w:w="80" w:type="dxa"/>
-              <w:start w:w="120" w:type="dxa"/>
-              <w:bottom w:w="80" w:type="dxa"/>
-              <w:end w:w="120" w:type="dxa"/>
-            </w:tcMar>
-            <w:vAlign w:val="center"/>
-          </w:tcPr>
-          <w:p>
-            <w:pPr>
-              <w:spacing w:before="0" w:after="0" w:line="276" w:lineRule="auto"/>
-              <w:jc w:val="left"/>
-            </w:pPr>
-            <w:r>
-              <w:rPr>
-                <w:rFonts w:ascii="Malgun Gothic" w:hAnsi="Malgun Gothic" w:eastAsia="Malgun Gothic"/>
-                <w:b w:val="0"/>
-                <w:color w:val="21172E"/>
-                <w:sz w:val="18"/>
-              </w:rPr>
-              <w:t>교사 의견을 새 의견 → 확인 중 → 완료로 관리</w:t>
-            </w:r>
-          </w:p>
-        </w:tc>
-      </w:tr>
-      <w:tr>
-        <w:tc>
-          <w:tcPr>
-            <w:tcW w:type="dxa" w:w="2700"/>
-            <w:tcMar>
-              <w:top w:w="80" w:type="dxa"/>
-              <w:start w:w="120" w:type="dxa"/>
-              <w:bottom w:w="80" w:type="dxa"/>
-              <w:end w:w="120" w:type="dxa"/>
-            </w:tcMar>
-            <w:vAlign w:val="center"/>
-          </w:tcPr>
-          <w:p>
-            <w:pPr>
-              <w:spacing w:before="0" w:after="0" w:line="276" w:lineRule="auto"/>
-              <w:jc w:val="left"/>
-            </w:pPr>
-            <w:r>
-              <w:rPr>
-                <w:rFonts w:ascii="Malgun Gothic" w:hAnsi="Malgun Gothic" w:eastAsia="Malgun Gothic"/>
-                <w:b w:val="0"/>
-                <w:color w:val="21172E"/>
-                <w:sz w:val="18"/>
-              </w:rPr>
-              <w:t>크루·교사·학생</w:t>
-            </w:r>
-          </w:p>
-        </w:tc>
-        <w:tc>
-          <w:tcPr>
-            <w:tcW w:type="dxa" w:w="6660"/>
-            <w:tcMar>
-              <w:top w:w="80" w:type="dxa"/>
-              <w:start w:w="120" w:type="dxa"/>
-              <w:bottom w:w="80" w:type="dxa"/>
-              <w:end w:w="120" w:type="dxa"/>
-            </w:tcMar>
-            <w:vAlign w:val="center"/>
-          </w:tcPr>
-          <w:p>
-            <w:pPr>
-              <w:spacing w:before="0" w:after="0" w:line="276" w:lineRule="auto"/>
-              <w:jc w:val="left"/>
-            </w:pPr>
-            <w:r>
-              <w:rPr>
-                <w:rFonts w:ascii="Malgun Gothic" w:hAnsi="Malgun Gothic" w:eastAsia="Malgun Gothic"/>
-                <w:b w:val="0"/>
-                <w:color w:val="21172E"/>
-                <w:sz w:val="18"/>
-              </w:rPr>
-              <w:t>등록, 배정, PIN 초기화, 상태와 소속 관리</w:t>
-            </w:r>
-          </w:p>
-        </w:tc>
-      </w:tr>
-      <w:tr>
-        <w:tc>
-          <w:tcPr>
-            <w:tcW w:type="dxa" w:w="2700"/>
-            <w:tcMar>
-              <w:top w:w="80" w:type="dxa"/>
-              <w:start w:w="120" w:type="dxa"/>
-              <w:bottom w:w="80" w:type="dxa"/>
-              <w:end w:w="120" w:type="dxa"/>
-            </w:tcMar>
-            <w:vAlign w:val="center"/>
-          </w:tcPr>
-          <w:p>
-            <w:pPr>
-              <w:spacing w:before="0" w:after="0" w:line="276" w:lineRule="auto"/>
-              <w:jc w:val="left"/>
-            </w:pPr>
-            <w:r>
-              <w:rPr>
-                <w:rFonts w:ascii="Malgun Gothic" w:hAnsi="Malgun Gothic" w:eastAsia="Malgun Gothic"/>
-                <w:b w:val="0"/>
-                <w:color w:val="21172E"/>
-                <w:sz w:val="18"/>
-              </w:rPr>
-              <w:t>변경 이력</w:t>
-            </w:r>
-          </w:p>
-        </w:tc>
-        <w:tc>
-          <w:tcPr>
-            <w:tcW w:type="dxa" w:w="6660"/>
-            <w:tcMar>
-              <w:top w:w="80" w:type="dxa"/>
-              <w:start w:w="120" w:type="dxa"/>
-              <w:bottom w:w="80" w:type="dxa"/>
-              <w:end w:w="120" w:type="dxa"/>
-            </w:tcMar>
-            <w:vAlign w:val="center"/>
-          </w:tcPr>
-          <w:p>
-            <w:pPr>
-              <w:spacing w:before="0" w:after="0" w:line="276" w:lineRule="auto"/>
-              <w:jc w:val="left"/>
-            </w:pPr>
-            <w:r>
-              <w:rPr>
-                <w:rFonts w:ascii="Malgun Gothic" w:hAnsi="Malgun Gothic" w:eastAsia="Malgun Gothic"/>
-                <w:b w:val="0"/>
-                <w:color w:val="21172E"/>
-                <w:sz w:val="18"/>
-              </w:rPr>
-              <w:t>누가 언제 어떤 출석과 정보를 바꿨는지 확인</w:t>
+              <w:t>결석 사유, 연락 안 됨 또는 학생 비고가 있는 학생은 표에서 노란색으로 표시되어 먼저 확인할 수 있습니다.</w:t>
             </w:r>
           </w:p>
         </w:tc>
@@ -2369,20 +2190,476 @@
           <w:color w:val="5B21B6"/>
           <w:sz w:val="32"/>
         </w:rPr>
-        <w:t>5. 오류·개선 의견과 유지보수</w:t>
+        <w:t>5. 임원교사 관리 기능</w:t>
       </w:r>
     </w:p>
     <w:p>
       <w:pPr>
-        <w:spacing w:after="120" w:line="300" w:lineRule="auto"/>
-        <w:jc w:val="left"/>
+        <w:pStyle w:val="Heading2"/>
+      </w:pPr>
+      <w:r>
+        <w:rPr>
+          <w:rFonts w:ascii="Malgun Gothic" w:hAnsi="Malgun Gothic" w:eastAsia="Malgun Gothic"/>
+          <w:b/>
+          <w:color w:val="5B21B6"/>
+          <w:sz w:val="26"/>
+        </w:rPr>
+        <w:t>크루 관리</w:t>
+      </w:r>
+    </w:p>
+    <w:p>
+      <w:pPr>
+        <w:numPr>
+          <w:ilvl w:val="0"/>
+          <w:numId w:val="10"/>
+        </w:numPr>
+        <w:spacing w:after="80" w:line="300" w:lineRule="auto"/>
       </w:pPr>
       <w:r>
         <w:rPr>
           <w:rFonts w:ascii="Malgun Gothic" w:hAnsi="Malgun Gothic" w:eastAsia="Malgun Gothic"/>
           <w:color w:val="21172E"/>
         </w:rPr>
-        <w:t>교사 피드백을 바로 모으고 수정 여부를 추적할 수 있도록 모든 로그인 후 화면에 오류·개선 의견 보내기 버튼이 있습니다.</w:t>
+        <w:t>크루명과 운영 연도를 입력해 새 크루를 등록합니다.</w:t>
+      </w:r>
+    </w:p>
+    <w:p>
+      <w:pPr>
+        <w:numPr>
+          <w:ilvl w:val="0"/>
+          <w:numId w:val="10"/>
+        </w:numPr>
+        <w:spacing w:after="80" w:line="300" w:lineRule="auto"/>
+      </w:pPr>
+      <w:r>
+        <w:rPr>
+          <w:rFonts w:ascii="Malgun Gothic" w:hAnsi="Malgun Gothic" w:eastAsia="Malgun Gothic"/>
+          <w:color w:val="21172E"/>
+        </w:rPr>
+        <w:t>크루 행에서 담당교사 이름을 선택하고 배정 저장을 누릅니다.</w:t>
+      </w:r>
+    </w:p>
+    <w:p>
+      <w:pPr>
+        <w:numPr>
+          <w:ilvl w:val="0"/>
+          <w:numId w:val="10"/>
+        </w:numPr>
+        <w:spacing w:after="80" w:line="300" w:lineRule="auto"/>
+      </w:pPr>
+      <w:r>
+        <w:rPr>
+          <w:rFonts w:ascii="Malgun Gothic" w:hAnsi="Malgun Gothic" w:eastAsia="Malgun Gothic"/>
+          <w:color w:val="21172E"/>
+        </w:rPr>
+        <w:t>운영 종료는 확인창을 거쳐 처리합니다. 과거 기록은 삭제되지 않습니다.</w:t>
+      </w:r>
+    </w:p>
+    <w:p>
+      <w:pPr>
+        <w:pStyle w:val="Heading2"/>
+      </w:pPr>
+      <w:r>
+        <w:rPr>
+          <w:rFonts w:ascii="Malgun Gothic" w:hAnsi="Malgun Gothic" w:eastAsia="Malgun Gothic"/>
+          <w:b/>
+          <w:color w:val="5B21B6"/>
+          <w:sz w:val="26"/>
+        </w:rPr>
+        <w:t>교사 관리</w:t>
+      </w:r>
+    </w:p>
+    <w:p>
+      <w:pPr>
+        <w:numPr>
+          <w:ilvl w:val="0"/>
+          <w:numId w:val="10"/>
+        </w:numPr>
+        <w:spacing w:after="80" w:line="300" w:lineRule="auto"/>
+      </w:pPr>
+      <w:r>
+        <w:rPr>
+          <w:rFonts w:ascii="Malgun Gothic" w:hAnsi="Malgun Gothic" w:eastAsia="Malgun Gothic"/>
+          <w:color w:val="21172E"/>
+        </w:rPr>
+        <w:t>교사 이름, 처음 사용할 PIN, 담당교사 또는 임원교사 역할을 선택해 등록합니다.</w:t>
+      </w:r>
+    </w:p>
+    <w:p>
+      <w:pPr>
+        <w:numPr>
+          <w:ilvl w:val="0"/>
+          <w:numId w:val="10"/>
+        </w:numPr>
+        <w:spacing w:after="80" w:line="300" w:lineRule="auto"/>
+      </w:pPr>
+      <w:r>
+        <w:rPr>
+          <w:rFonts w:ascii="Malgun Gothic" w:hAnsi="Malgun Gothic" w:eastAsia="Malgun Gothic"/>
+          <w:color w:val="21172E"/>
+        </w:rPr>
+        <w:t>PIN을 잊은 교사의 새 PIN을 입력하고 PIN 초기화를 누릅니다.</w:t>
+      </w:r>
+    </w:p>
+    <w:p>
+      <w:pPr>
+        <w:numPr>
+          <w:ilvl w:val="0"/>
+          <w:numId w:val="10"/>
+        </w:numPr>
+        <w:spacing w:after="80" w:line="300" w:lineRule="auto"/>
+      </w:pPr>
+      <w:r>
+        <w:rPr>
+          <w:rFonts w:ascii="Malgun Gothic" w:hAnsi="Malgun Gothic" w:eastAsia="Malgun Gothic"/>
+          <w:color w:val="21172E"/>
+        </w:rPr>
+        <w:t>더 이상 사용하지 않는 계정은 비활성화하고, 필요하면 다시 활성화합니다.</w:t>
+      </w:r>
+    </w:p>
+    <w:p>
+      <w:pPr>
+        <w:numPr>
+          <w:ilvl w:val="0"/>
+          <w:numId w:val="10"/>
+        </w:numPr>
+        <w:spacing w:after="80" w:line="300" w:lineRule="auto"/>
+      </w:pPr>
+      <w:r>
+        <w:rPr>
+          <w:rFonts w:ascii="Malgun Gothic" w:hAnsi="Malgun Gothic" w:eastAsia="Malgun Gothic"/>
+          <w:color w:val="21172E"/>
+        </w:rPr>
+        <w:t>현재 로그인한 임원 본인 계정은 실수로 비활성화할 수 없습니다.</w:t>
+      </w:r>
+    </w:p>
+    <w:p>
+      <w:pPr>
+        <w:pStyle w:val="Heading2"/>
+      </w:pPr>
+      <w:r>
+        <w:rPr>
+          <w:rFonts w:ascii="Malgun Gothic" w:hAnsi="Malgun Gothic" w:eastAsia="Malgun Gothic"/>
+          <w:b/>
+          <w:color w:val="5B21B6"/>
+          <w:sz w:val="26"/>
+        </w:rPr>
+        <w:t>학생 관리</w:t>
+      </w:r>
+    </w:p>
+    <w:p>
+      <w:pPr>
+        <w:numPr>
+          <w:ilvl w:val="0"/>
+          <w:numId w:val="10"/>
+        </w:numPr>
+        <w:spacing w:after="80" w:line="300" w:lineRule="auto"/>
+      </w:pPr>
+      <w:r>
+        <w:rPr>
+          <w:rFonts w:ascii="Malgun Gothic" w:hAnsi="Malgun Gothic" w:eastAsia="Malgun Gothic"/>
+          <w:color w:val="21172E"/>
+        </w:rPr>
+        <w:t>학생 이름과 소속 크루를 선택해 등록합니다.</w:t>
+      </w:r>
+    </w:p>
+    <w:p>
+      <w:pPr>
+        <w:numPr>
+          <w:ilvl w:val="0"/>
+          <w:numId w:val="10"/>
+        </w:numPr>
+        <w:spacing w:after="80" w:line="300" w:lineRule="auto"/>
+      </w:pPr>
+      <w:r>
+        <w:rPr>
+          <w:rFonts w:ascii="Malgun Gothic" w:hAnsi="Malgun Gothic" w:eastAsia="Malgun Gothic"/>
+          <w:color w:val="21172E"/>
+        </w:rPr>
+        <w:t>학생 이름 검색으로 학생을 빠르게 찾습니다.</w:t>
+      </w:r>
+    </w:p>
+    <w:p>
+      <w:pPr>
+        <w:numPr>
+          <w:ilvl w:val="0"/>
+          <w:numId w:val="10"/>
+        </w:numPr>
+        <w:spacing w:after="80" w:line="300" w:lineRule="auto"/>
+      </w:pPr>
+      <w:r>
+        <w:rPr>
+          <w:rFonts w:ascii="Malgun Gothic" w:hAnsi="Malgun Gothic" w:eastAsia="Malgun Gothic"/>
+          <w:color w:val="21172E"/>
+        </w:rPr>
+        <w:t>상태를 활동, 장기결석, 퇴실 중 하나로 변경합니다.</w:t>
+      </w:r>
+    </w:p>
+    <w:p>
+      <w:pPr>
+        <w:numPr>
+          <w:ilvl w:val="0"/>
+          <w:numId w:val="10"/>
+        </w:numPr>
+        <w:spacing w:after="80" w:line="300" w:lineRule="auto"/>
+      </w:pPr>
+      <w:r>
+        <w:rPr>
+          <w:rFonts w:ascii="Malgun Gothic" w:hAnsi="Malgun Gothic" w:eastAsia="Malgun Gothic"/>
+          <w:color w:val="21172E"/>
+        </w:rPr>
+        <w:t>다른 크루가 있을 때 이동할 크루를 선택하고 크루 이동을 누릅니다.</w:t>
+      </w:r>
+    </w:p>
+    <w:tbl>
+      <w:tblPr>
+        <w:tblW w:type="dxa" w:w="9360"/>
+        <w:jc w:val="left"/>
+        <w:tblLayout w:type="fixed"/>
+        <w:tblLook w:firstColumn="1" w:firstRow="1" w:lastColumn="0" w:lastRow="0" w:noHBand="0" w:noVBand="1" w:val="04A0"/>
+        <w:tblInd w:w="120" w:type="dxa"/>
+      </w:tblPr>
+      <w:tblGrid>
+        <w:gridCol w:w="9360"/>
+      </w:tblGrid>
+      <w:tr>
+        <w:trPr>
+          <w:tblHeader w:val="true"/>
+        </w:trPr>
+        <w:tc>
+          <w:tcPr>
+            <w:tcW w:type="dxa" w:w="9360"/>
+            <w:tcMar>
+              <w:top w:w="80" w:type="dxa"/>
+              <w:start w:w="120" w:type="dxa"/>
+              <w:bottom w:w="80" w:type="dxa"/>
+              <w:end w:w="120" w:type="dxa"/>
+            </w:tcMar>
+            <w:vAlign w:val="center"/>
+            <w:shd w:fill="FFF8E6"/>
+          </w:tcPr>
+          <w:p>
+            <w:pPr>
+              <w:spacing w:after="80"/>
+            </w:pPr>
+            <w:r>
+              <w:rPr>
+                <w:rFonts w:ascii="Malgun Gothic" w:hAnsi="Malgun Gothic" w:eastAsia="Malgun Gothic"/>
+                <w:b/>
+                <w:color w:val="B7791F"/>
+                <w:sz w:val="22"/>
+              </w:rPr>
+              <w:t>삭제 대신 상태 변경</w:t>
+            </w:r>
+          </w:p>
+          <w:p>
+            <w:pPr>
+              <w:spacing w:after="0" w:line="288" w:lineRule="auto"/>
+            </w:pPr>
+            <w:r>
+              <w:rPr>
+                <w:rFonts w:ascii="Malgun Gothic" w:hAnsi="Malgun Gothic" w:eastAsia="Malgun Gothic"/>
+                <w:color w:val="21172E"/>
+                <w:sz w:val="20"/>
+              </w:rPr>
+              <w:t>학생과 교사를 직접 삭제하지 않고 상태와 활성 여부를 관리해 과거 출석과 변경 기록을 보존합니다.</w:t>
+            </w:r>
+          </w:p>
+        </w:tc>
+      </w:tr>
+    </w:tbl>
+    <w:p>
+      <w:pPr>
+        <w:spacing w:after="20"/>
+      </w:pPr>
+    </w:p>
+    <w:p>
+      <w:r>
+        <w:br w:type="page"/>
+      </w:r>
+    </w:p>
+    <w:p>
+      <w:pPr>
+        <w:pStyle w:val="Heading1"/>
+      </w:pPr>
+      <w:r>
+        <w:rPr>
+          <w:rFonts w:ascii="Malgun Gothic" w:hAnsi="Malgun Gothic" w:eastAsia="Malgun Gothic"/>
+          <w:b/>
+          <w:color w:val="5B21B6"/>
+          <w:sz w:val="32"/>
+        </w:rPr>
+        <w:t>6. 공지·임시 확인 항목·의견함</w:t>
+      </w:r>
+    </w:p>
+    <w:p>
+      <w:pPr>
+        <w:pStyle w:val="Heading2"/>
+      </w:pPr>
+      <w:r>
+        <w:rPr>
+          <w:rFonts w:ascii="Malgun Gothic" w:hAnsi="Malgun Gothic" w:eastAsia="Malgun Gothic"/>
+          <w:b/>
+          <w:color w:val="5B21B6"/>
+          <w:sz w:val="26"/>
+        </w:rPr>
+        <w:t>교사에게 공지 올리기</w:t>
+      </w:r>
+    </w:p>
+    <w:p>
+      <w:pPr>
+        <w:numPr>
+          <w:ilvl w:val="0"/>
+          <w:numId w:val="10"/>
+        </w:numPr>
+        <w:spacing w:after="80" w:line="300" w:lineRule="auto"/>
+      </w:pPr>
+      <w:r>
+        <w:rPr>
+          <w:rFonts w:ascii="Malgun Gothic" w:hAnsi="Malgun Gothic" w:eastAsia="Malgun Gothic"/>
+          <w:color w:val="21172E"/>
+        </w:rPr>
+        <w:t>공지·임시 항목 메뉴를 엽니다.</w:t>
+      </w:r>
+    </w:p>
+    <w:p>
+      <w:pPr>
+        <w:numPr>
+          <w:ilvl w:val="0"/>
+          <w:numId w:val="10"/>
+        </w:numPr>
+        <w:spacing w:after="80" w:line="300" w:lineRule="auto"/>
+      </w:pPr>
+      <w:r>
+        <w:rPr>
+          <w:rFonts w:ascii="Malgun Gothic" w:hAnsi="Malgun Gothic" w:eastAsia="Malgun Gothic"/>
+          <w:color w:val="21172E"/>
+        </w:rPr>
+        <w:t>종류에서 공지를 선택합니다.</w:t>
+      </w:r>
+    </w:p>
+    <w:p>
+      <w:pPr>
+        <w:numPr>
+          <w:ilvl w:val="0"/>
+          <w:numId w:val="10"/>
+        </w:numPr>
+        <w:spacing w:after="80" w:line="300" w:lineRule="auto"/>
+      </w:pPr>
+      <w:r>
+        <w:rPr>
+          <w:rFonts w:ascii="Malgun Gothic" w:hAnsi="Malgun Gothic" w:eastAsia="Malgun Gothic"/>
+          <w:color w:val="21172E"/>
+        </w:rPr>
+        <w:t>제목, 설명, 시작일과 종료일을 입력해 게시합니다.</w:t>
+      </w:r>
+    </w:p>
+    <w:p>
+      <w:pPr>
+        <w:pStyle w:val="Heading2"/>
+      </w:pPr>
+      <w:r>
+        <w:rPr>
+          <w:rFonts w:ascii="Malgun Gothic" w:hAnsi="Malgun Gothic" w:eastAsia="Malgun Gothic"/>
+          <w:b/>
+          <w:color w:val="5B21B6"/>
+          <w:sz w:val="26"/>
+        </w:rPr>
+        <w:t>학생별 임시 확인 칸 만들기</w:t>
+      </w:r>
+    </w:p>
+    <w:p>
+      <w:pPr>
+        <w:numPr>
+          <w:ilvl w:val="0"/>
+          <w:numId w:val="10"/>
+        </w:numPr>
+        <w:spacing w:after="80" w:line="300" w:lineRule="auto"/>
+      </w:pPr>
+      <w:r>
+        <w:rPr>
+          <w:rFonts w:ascii="Malgun Gothic" w:hAnsi="Malgun Gothic" w:eastAsia="Malgun Gothic"/>
+          <w:color w:val="21172E"/>
+        </w:rPr>
+        <w:t>종류에서 학생별 임시 확인 칸을 선택합니다.</w:t>
+      </w:r>
+    </w:p>
+    <w:p>
+      <w:pPr>
+        <w:numPr>
+          <w:ilvl w:val="0"/>
+          <w:numId w:val="10"/>
+        </w:numPr>
+        <w:spacing w:after="80" w:line="300" w:lineRule="auto"/>
+      </w:pPr>
+      <w:r>
+        <w:rPr>
+          <w:rFonts w:ascii="Malgun Gothic" w:hAnsi="Malgun Gothic" w:eastAsia="Malgun Gothic"/>
+          <w:color w:val="21172E"/>
+        </w:rPr>
+        <w:t>제목과 교사에게 보일 설명을 입력합니다.</w:t>
+      </w:r>
+    </w:p>
+    <w:p>
+      <w:pPr>
+        <w:numPr>
+          <w:ilvl w:val="0"/>
+          <w:numId w:val="10"/>
+        </w:numPr>
+        <w:spacing w:after="80" w:line="300" w:lineRule="auto"/>
+      </w:pPr>
+      <w:r>
+        <w:rPr>
+          <w:rFonts w:ascii="Malgun Gothic" w:hAnsi="Malgun Gothic" w:eastAsia="Malgun Gothic"/>
+          <w:color w:val="21172E"/>
+        </w:rPr>
+        <w:t>선택지를 쉼표로 구분합니다. 예: 신청, 미신청, 고려중.</w:t>
+      </w:r>
+    </w:p>
+    <w:p>
+      <w:pPr>
+        <w:numPr>
+          <w:ilvl w:val="0"/>
+          <w:numId w:val="10"/>
+        </w:numPr>
+        <w:spacing w:after="80" w:line="300" w:lineRule="auto"/>
+      </w:pPr>
+      <w:r>
+        <w:rPr>
+          <w:rFonts w:ascii="Malgun Gothic" w:hAnsi="Malgun Gothic" w:eastAsia="Malgun Gothic"/>
+          <w:color w:val="21172E"/>
+        </w:rPr>
+        <w:t>필수 여부와 게시 기간을 정해 출석 화면에 게시합니다.</w:t>
+      </w:r>
+    </w:p>
+    <w:p>
+      <w:pPr>
+        <w:numPr>
+          <w:ilvl w:val="0"/>
+          <w:numId w:val="10"/>
+        </w:numPr>
+        <w:spacing w:after="80" w:line="300" w:lineRule="auto"/>
+      </w:pPr>
+      <w:r>
+        <w:rPr>
+          <w:rFonts w:ascii="Malgun Gothic" w:hAnsi="Malgun Gothic" w:eastAsia="Malgun Gothic"/>
+          <w:color w:val="21172E"/>
+        </w:rPr>
+        <w:t>기간이 끝나면 화면에서 자동으로 숨겨지며 입력된 응답은 보존됩니다.</w:t>
+      </w:r>
+    </w:p>
+    <w:p>
+      <w:pPr>
+        <w:pStyle w:val="Heading2"/>
+      </w:pPr>
+      <w:r>
+        <w:rPr>
+          <w:rFonts w:ascii="Malgun Gothic" w:hAnsi="Malgun Gothic" w:eastAsia="Malgun Gothic"/>
+          <w:b/>
+          <w:color w:val="5B21B6"/>
+          <w:sz w:val="26"/>
+        </w:rPr>
+        <w:t>오류·개선 의견 처리</w:t>
       </w:r>
     </w:p>
     <w:p>
@@ -2430,23 +2707,7 @@
           <w:rFonts w:ascii="Malgun Gothic" w:hAnsi="Malgun Gothic" w:eastAsia="Malgun Gothic"/>
           <w:color w:val="21172E"/>
         </w:rPr>
-        <w:t>관리 담당자가 프로젝트 수정과 테스트를 진행합니다.</w:t>
-      </w:r>
-    </w:p>
-    <w:p>
-      <w:pPr>
-        <w:numPr>
-          <w:ilvl w:val="0"/>
-          <w:numId w:val="10"/>
-        </w:numPr>
-        <w:spacing w:after="80" w:line="300" w:lineRule="auto"/>
-      </w:pPr>
-      <w:r>
-        <w:rPr>
-          <w:rFonts w:ascii="Malgun Gothic" w:hAnsi="Malgun Gothic" w:eastAsia="Malgun Gothic"/>
-          <w:color w:val="21172E"/>
-        </w:rPr>
-        <w:t>데모 화면에서 담당 교사가 수정 결과를 확인합니다.</w:t>
+        <w:t>수정 담당자가 데모 화면과 테스트로 변경을 확인합니다.</w:t>
       </w:r>
     </w:p>
     <w:p>
@@ -2466,6 +2727,385 @@
       </w:r>
     </w:p>
     <w:p>
+      <w:r>
+        <w:br w:type="page"/>
+      </w:r>
+    </w:p>
+    <w:p>
+      <w:pPr>
+        <w:pStyle w:val="Heading1"/>
+      </w:pPr>
+      <w:r>
+        <w:rPr>
+          <w:rFonts w:ascii="Malgun Gothic" w:hAnsi="Malgun Gothic" w:eastAsia="Malgun Gothic"/>
+          <w:b/>
+          <w:color w:val="5B21B6"/>
+          <w:sz w:val="32"/>
+        </w:rPr>
+        <w:t>7. 로그인·PIN·개인정보 안전수칙</w:t>
+      </w:r>
+    </w:p>
+    <w:tbl>
+      <w:tblPr>
+        <w:tblStyle w:val="TableGrid"/>
+        <w:tblW w:type="dxa" w:w="9360"/>
+        <w:tblLayout w:type="fixed"/>
+        <w:tblLook w:firstColumn="1" w:firstRow="1" w:lastColumn="0" w:lastRow="0" w:noHBand="0" w:noVBand="1" w:val="04A0"/>
+        <w:jc w:val="left"/>
+        <w:tblInd w:w="120" w:type="dxa"/>
+      </w:tblPr>
+      <w:tblGrid>
+        <w:gridCol w:w="2340"/>
+        <w:gridCol w:w="7020"/>
+      </w:tblGrid>
+      <w:tr>
+        <w:trPr>
+          <w:tblHeader w:val="true"/>
+        </w:trPr>
+        <w:tc>
+          <w:tcPr>
+            <w:tcW w:type="dxa" w:w="2340"/>
+            <w:tcMar>
+              <w:top w:w="80" w:type="dxa"/>
+              <w:start w:w="120" w:type="dxa"/>
+              <w:bottom w:w="80" w:type="dxa"/>
+              <w:end w:w="120" w:type="dxa"/>
+            </w:tcMar>
+            <w:vAlign w:val="center"/>
+            <w:shd w:fill="E8EEF5"/>
+          </w:tcPr>
+          <w:p>
+            <w:pPr>
+              <w:spacing w:before="0" w:after="0" w:line="276" w:lineRule="auto"/>
+              <w:jc w:val="left"/>
+            </w:pPr>
+            <w:r>
+              <w:rPr>
+                <w:rFonts w:ascii="Malgun Gothic" w:hAnsi="Malgun Gothic" w:eastAsia="Malgun Gothic"/>
+                <w:b/>
+                <w:color w:val="3B0764"/>
+                <w:sz w:val="18"/>
+              </w:rPr>
+              <w:t>상황</w:t>
+            </w:r>
+          </w:p>
+        </w:tc>
+        <w:tc>
+          <w:tcPr>
+            <w:tcW w:type="dxa" w:w="7020"/>
+            <w:tcMar>
+              <w:top w:w="80" w:type="dxa"/>
+              <w:start w:w="120" w:type="dxa"/>
+              <w:bottom w:w="80" w:type="dxa"/>
+              <w:end w:w="120" w:type="dxa"/>
+            </w:tcMar>
+            <w:vAlign w:val="center"/>
+            <w:shd w:fill="E8EEF5"/>
+          </w:tcPr>
+          <w:p>
+            <w:pPr>
+              <w:spacing w:before="0" w:after="0" w:line="276" w:lineRule="auto"/>
+              <w:jc w:val="left"/>
+            </w:pPr>
+            <w:r>
+              <w:rPr>
+                <w:rFonts w:ascii="Malgun Gothic" w:hAnsi="Malgun Gothic" w:eastAsia="Malgun Gothic"/>
+                <w:b/>
+                <w:color w:val="3B0764"/>
+                <w:sz w:val="18"/>
+              </w:rPr>
+              <w:t>올바른 사용</w:t>
+            </w:r>
+          </w:p>
+        </w:tc>
+      </w:tr>
+      <w:tr>
+        <w:tc>
+          <w:tcPr>
+            <w:tcW w:type="dxa" w:w="2340"/>
+            <w:tcMar>
+              <w:top w:w="80" w:type="dxa"/>
+              <w:start w:w="120" w:type="dxa"/>
+              <w:bottom w:w="80" w:type="dxa"/>
+              <w:end w:w="120" w:type="dxa"/>
+            </w:tcMar>
+            <w:vAlign w:val="center"/>
+          </w:tcPr>
+          <w:p>
+            <w:pPr>
+              <w:spacing w:before="0" w:after="0" w:line="276" w:lineRule="auto"/>
+              <w:jc w:val="left"/>
+            </w:pPr>
+            <w:r>
+              <w:rPr>
+                <w:rFonts w:ascii="Malgun Gothic" w:hAnsi="Malgun Gothic" w:eastAsia="Malgun Gothic"/>
+                <w:b w:val="0"/>
+                <w:color w:val="21172E"/>
+                <w:sz w:val="18"/>
+              </w:rPr>
+              <w:t>개인 휴대폰·컴퓨터</w:t>
+            </w:r>
+          </w:p>
+        </w:tc>
+        <w:tc>
+          <w:tcPr>
+            <w:tcW w:type="dxa" w:w="7020"/>
+            <w:tcMar>
+              <w:top w:w="80" w:type="dxa"/>
+              <w:start w:w="120" w:type="dxa"/>
+              <w:bottom w:w="80" w:type="dxa"/>
+              <w:end w:w="120" w:type="dxa"/>
+            </w:tcMar>
+            <w:vAlign w:val="center"/>
+          </w:tcPr>
+          <w:p>
+            <w:pPr>
+              <w:spacing w:before="0" w:after="0" w:line="276" w:lineRule="auto"/>
+              <w:jc w:val="left"/>
+            </w:pPr>
+            <w:r>
+              <w:rPr>
+                <w:rFonts w:ascii="Malgun Gothic" w:hAnsi="Malgun Gothic" w:eastAsia="Malgun Gothic"/>
+                <w:b w:val="0"/>
+                <w:color w:val="21172E"/>
+                <w:sz w:val="18"/>
+              </w:rPr>
+              <w:t>로그인을 최대 30일 유지해 반복 입력을 줄입니다.</w:t>
+            </w:r>
+          </w:p>
+        </w:tc>
+      </w:tr>
+      <w:tr>
+        <w:tc>
+          <w:tcPr>
+            <w:tcW w:type="dxa" w:w="2340"/>
+            <w:tcMar>
+              <w:top w:w="80" w:type="dxa"/>
+              <w:start w:w="120" w:type="dxa"/>
+              <w:bottom w:w="80" w:type="dxa"/>
+              <w:end w:w="120" w:type="dxa"/>
+            </w:tcMar>
+            <w:vAlign w:val="center"/>
+          </w:tcPr>
+          <w:p>
+            <w:pPr>
+              <w:spacing w:before="0" w:after="0" w:line="276" w:lineRule="auto"/>
+              <w:jc w:val="left"/>
+            </w:pPr>
+            <w:r>
+              <w:rPr>
+                <w:rFonts w:ascii="Malgun Gothic" w:hAnsi="Malgun Gothic" w:eastAsia="Malgun Gothic"/>
+                <w:b w:val="0"/>
+                <w:color w:val="21172E"/>
+                <w:sz w:val="18"/>
+              </w:rPr>
+              <w:t>교회 공용 기기</w:t>
+            </w:r>
+          </w:p>
+        </w:tc>
+        <w:tc>
+          <w:tcPr>
+            <w:tcW w:type="dxa" w:w="7020"/>
+            <w:tcMar>
+              <w:top w:w="80" w:type="dxa"/>
+              <w:start w:w="120" w:type="dxa"/>
+              <w:bottom w:w="80" w:type="dxa"/>
+              <w:end w:w="120" w:type="dxa"/>
+            </w:tcMar>
+            <w:vAlign w:val="center"/>
+          </w:tcPr>
+          <w:p>
+            <w:pPr>
+              <w:spacing w:before="0" w:after="0" w:line="276" w:lineRule="auto"/>
+              <w:jc w:val="left"/>
+            </w:pPr>
+            <w:r>
+              <w:rPr>
+                <w:rFonts w:ascii="Malgun Gothic" w:hAnsi="Malgun Gothic" w:eastAsia="Malgun Gothic"/>
+                <w:b w:val="0"/>
+                <w:color w:val="21172E"/>
+                <w:sz w:val="18"/>
+              </w:rPr>
+              <w:t>업무가 끝나면 왼쪽 또는 상단의 로그아웃을 누릅니다.</w:t>
+            </w:r>
+          </w:p>
+        </w:tc>
+      </w:tr>
+      <w:tr>
+        <w:tc>
+          <w:tcPr>
+            <w:tcW w:type="dxa" w:w="2340"/>
+            <w:tcMar>
+              <w:top w:w="80" w:type="dxa"/>
+              <w:start w:w="120" w:type="dxa"/>
+              <w:bottom w:w="80" w:type="dxa"/>
+              <w:end w:w="120" w:type="dxa"/>
+            </w:tcMar>
+            <w:vAlign w:val="center"/>
+          </w:tcPr>
+          <w:p>
+            <w:pPr>
+              <w:spacing w:before="0" w:after="0" w:line="276" w:lineRule="auto"/>
+              <w:jc w:val="left"/>
+            </w:pPr>
+            <w:r>
+              <w:rPr>
+                <w:rFonts w:ascii="Malgun Gothic" w:hAnsi="Malgun Gothic" w:eastAsia="Malgun Gothic"/>
+                <w:b w:val="0"/>
+                <w:color w:val="21172E"/>
+                <w:sz w:val="18"/>
+              </w:rPr>
+              <w:t>PIN 5회 오류</w:t>
+            </w:r>
+          </w:p>
+        </w:tc>
+        <w:tc>
+          <w:tcPr>
+            <w:tcW w:type="dxa" w:w="7020"/>
+            <w:tcMar>
+              <w:top w:w="80" w:type="dxa"/>
+              <w:start w:w="120" w:type="dxa"/>
+              <w:bottom w:w="80" w:type="dxa"/>
+              <w:end w:w="120" w:type="dxa"/>
+            </w:tcMar>
+            <w:vAlign w:val="center"/>
+          </w:tcPr>
+          <w:p>
+            <w:pPr>
+              <w:spacing w:before="0" w:after="0" w:line="276" w:lineRule="auto"/>
+              <w:jc w:val="left"/>
+            </w:pPr>
+            <w:r>
+              <w:rPr>
+                <w:rFonts w:ascii="Malgun Gothic" w:hAnsi="Malgun Gothic" w:eastAsia="Malgun Gothic"/>
+                <w:b w:val="0"/>
+                <w:color w:val="21172E"/>
+                <w:sz w:val="18"/>
+              </w:rPr>
+              <w:t>10분 동안 잠기므로 반복 입력하지 말고 기다립니다.</w:t>
+            </w:r>
+          </w:p>
+        </w:tc>
+      </w:tr>
+      <w:tr>
+        <w:tc>
+          <w:tcPr>
+            <w:tcW w:type="dxa" w:w="2340"/>
+            <w:tcMar>
+              <w:top w:w="80" w:type="dxa"/>
+              <w:start w:w="120" w:type="dxa"/>
+              <w:bottom w:w="80" w:type="dxa"/>
+              <w:end w:w="120" w:type="dxa"/>
+            </w:tcMar>
+            <w:vAlign w:val="center"/>
+          </w:tcPr>
+          <w:p>
+            <w:pPr>
+              <w:spacing w:before="0" w:after="0" w:line="276" w:lineRule="auto"/>
+              <w:jc w:val="left"/>
+            </w:pPr>
+            <w:r>
+              <w:rPr>
+                <w:rFonts w:ascii="Malgun Gothic" w:hAnsi="Malgun Gothic" w:eastAsia="Malgun Gothic"/>
+                <w:b w:val="0"/>
+                <w:color w:val="21172E"/>
+                <w:sz w:val="18"/>
+              </w:rPr>
+              <w:t>PIN 분실</w:t>
+            </w:r>
+          </w:p>
+        </w:tc>
+        <w:tc>
+          <w:tcPr>
+            <w:tcW w:type="dxa" w:w="7020"/>
+            <w:tcMar>
+              <w:top w:w="80" w:type="dxa"/>
+              <w:start w:w="120" w:type="dxa"/>
+              <w:bottom w:w="80" w:type="dxa"/>
+              <w:end w:w="120" w:type="dxa"/>
+            </w:tcMar>
+            <w:vAlign w:val="center"/>
+          </w:tcPr>
+          <w:p>
+            <w:pPr>
+              <w:spacing w:before="0" w:after="0" w:line="276" w:lineRule="auto"/>
+              <w:jc w:val="left"/>
+            </w:pPr>
+            <w:r>
+              <w:rPr>
+                <w:rFonts w:ascii="Malgun Gothic" w:hAnsi="Malgun Gothic" w:eastAsia="Malgun Gothic"/>
+                <w:b w:val="0"/>
+                <w:color w:val="21172E"/>
+                <w:sz w:val="18"/>
+              </w:rPr>
+              <w:t>임원교사가 교사 관리에서 새 PIN으로 초기화합니다.</w:t>
+            </w:r>
+          </w:p>
+        </w:tc>
+      </w:tr>
+      <w:tr>
+        <w:tc>
+          <w:tcPr>
+            <w:tcW w:type="dxa" w:w="2340"/>
+            <w:tcMar>
+              <w:top w:w="80" w:type="dxa"/>
+              <w:start w:w="120" w:type="dxa"/>
+              <w:bottom w:w="80" w:type="dxa"/>
+              <w:end w:w="120" w:type="dxa"/>
+            </w:tcMar>
+            <w:vAlign w:val="center"/>
+          </w:tcPr>
+          <w:p>
+            <w:pPr>
+              <w:spacing w:before="0" w:after="0" w:line="276" w:lineRule="auto"/>
+              <w:jc w:val="left"/>
+            </w:pPr>
+            <w:r>
+              <w:rPr>
+                <w:rFonts w:ascii="Malgun Gothic" w:hAnsi="Malgun Gothic" w:eastAsia="Malgun Gothic"/>
+                <w:b w:val="0"/>
+                <w:color w:val="21172E"/>
+                <w:sz w:val="18"/>
+              </w:rPr>
+              <w:t>학생 개인정보</w:t>
+            </w:r>
+          </w:p>
+        </w:tc>
+        <w:tc>
+          <w:tcPr>
+            <w:tcW w:type="dxa" w:w="7020"/>
+            <w:tcMar>
+              <w:top w:w="80" w:type="dxa"/>
+              <w:start w:w="120" w:type="dxa"/>
+              <w:bottom w:w="80" w:type="dxa"/>
+              <w:end w:w="120" w:type="dxa"/>
+            </w:tcMar>
+            <w:vAlign w:val="center"/>
+          </w:tcPr>
+          <w:p>
+            <w:pPr>
+              <w:spacing w:before="0" w:after="0" w:line="276" w:lineRule="auto"/>
+              <w:jc w:val="left"/>
+            </w:pPr>
+            <w:r>
+              <w:rPr>
+                <w:rFonts w:ascii="Malgun Gothic" w:hAnsi="Malgun Gothic" w:eastAsia="Malgun Gothic"/>
+                <w:b w:val="0"/>
+                <w:color w:val="21172E"/>
+                <w:sz w:val="18"/>
+              </w:rPr>
+              <w:t>사역에 필요한 최소 범위만 기록하고 화면 캡처에서는 가립니다.</w:t>
+            </w:r>
+          </w:p>
+        </w:tc>
+      </w:tr>
+    </w:tbl>
+    <w:p>
+      <w:pPr>
+        <w:spacing w:after="20"/>
+      </w:pPr>
+    </w:p>
+    <w:p>
       <w:pPr>
         <w:pStyle w:val="Heading2"/>
       </w:pPr>
@@ -2476,7 +3116,7 @@
           <w:color w:val="5B21B6"/>
           <w:sz w:val="26"/>
         </w:rPr>
-        <w:t>수정 요청에 적으면 좋은 내용</w:t>
+        <w:t>기억해야 할 원칙</w:t>
       </w:r>
     </w:p>
     <w:p>
@@ -2492,7 +3132,7 @@
           <w:rFonts w:ascii="Malgun Gothic" w:hAnsi="Malgun Gothic" w:eastAsia="Malgun Gothic"/>
           <w:color w:val="21172E"/>
         </w:rPr>
-        <w:t>사용 역할과 화면 이름</w:t>
+        <w:t>교사 PIN은 단톡방, 사용설명서, 메모 사진에 남기지 않습니다.</w:t>
       </w:r>
     </w:p>
     <w:p>
@@ -2508,7 +3148,7 @@
           <w:rFonts w:ascii="Malgun Gothic" w:hAnsi="Malgun Gothic" w:eastAsia="Malgun Gothic"/>
           <w:color w:val="21172E"/>
         </w:rPr>
-        <w:t>어떤 버튼을 어떤 순서로 눌렀는지</w:t>
+        <w:t>Supabase 서비스 권한 키와 초기 관리자 코드는 GitHub에 올리지 않습니다.</w:t>
       </w:r>
     </w:p>
     <w:p>
@@ -2524,7 +3164,7 @@
           <w:rFonts w:ascii="Malgun Gothic" w:hAnsi="Malgun Gothic" w:eastAsia="Malgun Gothic"/>
           <w:color w:val="21172E"/>
         </w:rPr>
-        <w:t>기대한 결과와 실제 결과</w:t>
+        <w:t>학생은 삭제하지 않고 장기결석 또는 퇴실로 전환합니다.</w:t>
       </w:r>
     </w:p>
     <w:p>
@@ -2540,23 +3180,7 @@
           <w:rFonts w:ascii="Malgun Gothic" w:hAnsi="Malgun Gothic" w:eastAsia="Malgun Gothic"/>
           <w:color w:val="21172E"/>
         </w:rPr>
-        <w:t>오류가 발생한 날짜와 대략적인 시각</w:t>
-      </w:r>
-    </w:p>
-    <w:p>
-      <w:pPr>
-        <w:numPr>
-          <w:ilvl w:val="0"/>
-          <w:numId w:val="11"/>
-        </w:numPr>
-        <w:spacing w:after="80" w:line="300" w:lineRule="auto"/>
-      </w:pPr>
-      <w:r>
-        <w:rPr>
-          <w:rFonts w:ascii="Malgun Gothic" w:hAnsi="Malgun Gothic" w:eastAsia="Malgun Gothic"/>
-          <w:color w:val="21172E"/>
-        </w:rPr>
-        <w:t>가능하면 휴대폰 기종과 개인정보를 가린 화면 캡처</w:t>
+        <w:t>공용 기기에서는 반드시 로그아웃합니다.</w:t>
       </w:r>
     </w:p>
     <w:tbl>
@@ -2584,7 +3208,7 @@
               <w:end w:w="120" w:type="dxa"/>
             </w:tcMar>
             <w:vAlign w:val="center"/>
-            <w:shd w:fill="F1EAFE"/>
+            <w:shd w:fill="FFF8E6"/>
           </w:tcPr>
           <w:p>
             <w:pPr>
@@ -2594,10 +3218,10 @@
               <w:rPr>
                 <w:rFonts w:ascii="Malgun Gothic" w:hAnsi="Malgun Gothic" w:eastAsia="Malgun Gothic"/>
                 <w:b/>
-                <w:color w:val="5B21B6"/>
+                <w:color w:val="B7791F"/>
                 <w:sz w:val="22"/>
               </w:rPr>
-              <w:t>직접 확인하는 가장 쉬운 방법</w:t>
+              <w:t>보안상 문서에 적지 않는 것</w:t>
             </w:r>
           </w:p>
           <w:p>
@@ -2610,7 +3234,7 @@
                 <w:color w:val="21172E"/>
                 <w:sz w:val="20"/>
               </w:rPr>
-              <w:t>프로젝트 폴더의 개발_미리보기_실행.bat을 더블클릭합니다. 데모 PIN은 1234이며 실제 출석 데이터는 바뀌지 않습니다.</w:t>
+              <w:t>현재 사용 중인 PIN과 비밀키는 이 설명서에 포함하지 않습니다. 초기 PIN 전달과 변경은 임원에게 별도로 확인합니다.</w:t>
             </w:r>
           </w:p>
         </w:tc>
@@ -2637,7 +3261,7 @@
           <w:color w:val="5B21B6"/>
           <w:sz w:val="32"/>
         </w:rPr>
-        <w:t>6. 문제 발생 시와 안전 원칙</w:t>
+        <w:t>8. 문제가 생겼을 때</w:t>
       </w:r>
     </w:p>
     <w:tbl>
@@ -3099,6 +3723,89 @@
                 <w:color w:val="21172E"/>
                 <w:sz w:val="18"/>
               </w:rPr>
+              <w:t>화면이 예전 모습</w:t>
+            </w:r>
+          </w:p>
+        </w:tc>
+        <w:tc>
+          <w:tcPr>
+            <w:tcW w:type="dxa" w:w="3420"/>
+            <w:tcMar>
+              <w:top w:w="80" w:type="dxa"/>
+              <w:start w:w="120" w:type="dxa"/>
+              <w:bottom w:w="80" w:type="dxa"/>
+              <w:end w:w="120" w:type="dxa"/>
+            </w:tcMar>
+            <w:vAlign w:val="center"/>
+          </w:tcPr>
+          <w:p>
+            <w:pPr>
+              <w:spacing w:before="0" w:after="0" w:line="276" w:lineRule="auto"/>
+              <w:jc w:val="left"/>
+            </w:pPr>
+            <w:r>
+              <w:rPr>
+                <w:rFonts w:ascii="Malgun Gothic" w:hAnsi="Malgun Gothic" w:eastAsia="Malgun Gothic"/>
+                <w:b w:val="0"/>
+                <w:color w:val="21172E"/>
+                <w:sz w:val="18"/>
+              </w:rPr>
+              <w:t>브라우저 새로고침</w:t>
+            </w:r>
+          </w:p>
+        </w:tc>
+        <w:tc>
+          <w:tcPr>
+            <w:tcW w:type="dxa" w:w="3420"/>
+            <w:tcMar>
+              <w:top w:w="80" w:type="dxa"/>
+              <w:start w:w="120" w:type="dxa"/>
+              <w:bottom w:w="80" w:type="dxa"/>
+              <w:end w:w="120" w:type="dxa"/>
+            </w:tcMar>
+            <w:vAlign w:val="center"/>
+          </w:tcPr>
+          <w:p>
+            <w:pPr>
+              <w:spacing w:before="0" w:after="0" w:line="276" w:lineRule="auto"/>
+              <w:jc w:val="left"/>
+            </w:pPr>
+            <w:r>
+              <w:rPr>
+                <w:rFonts w:ascii="Malgun Gothic" w:hAnsi="Malgun Gothic" w:eastAsia="Malgun Gothic"/>
+                <w:b w:val="0"/>
+                <w:color w:val="21172E"/>
+                <w:sz w:val="18"/>
+              </w:rPr>
+              <w:t>컴퓨터는 Ctrl+F5</w:t>
+            </w:r>
+          </w:p>
+        </w:tc>
+      </w:tr>
+      <w:tr>
+        <w:tc>
+          <w:tcPr>
+            <w:tcW w:type="dxa" w:w="2520"/>
+            <w:tcMar>
+              <w:top w:w="80" w:type="dxa"/>
+              <w:start w:w="120" w:type="dxa"/>
+              <w:bottom w:w="80" w:type="dxa"/>
+              <w:end w:w="120" w:type="dxa"/>
+            </w:tcMar>
+            <w:vAlign w:val="center"/>
+          </w:tcPr>
+          <w:p>
+            <w:pPr>
+              <w:spacing w:before="0" w:after="0" w:line="276" w:lineRule="auto"/>
+              <w:jc w:val="left"/>
+            </w:pPr>
+            <w:r>
+              <w:rPr>
+                <w:rFonts w:ascii="Malgun Gothic" w:hAnsi="Malgun Gothic" w:eastAsia="Malgun Gothic"/>
+                <w:b w:val="0"/>
+                <w:color w:val="21172E"/>
+                <w:sz w:val="18"/>
+              </w:rPr>
               <w:t>긴급 출석 업무</w:t>
             </w:r>
           </w:p>
@@ -3175,7 +3882,7 @@
           <w:color w:val="5B21B6"/>
           <w:sz w:val="26"/>
         </w:rPr>
-        <w:t>개인정보와 기록 보존</w:t>
+        <w:t>오류를 신고할 때</w:t>
       </w:r>
     </w:p>
     <w:p>
@@ -3191,7 +3898,7 @@
           <w:rFonts w:ascii="Malgun Gothic" w:hAnsi="Malgun Gothic" w:eastAsia="Malgun Gothic"/>
           <w:color w:val="21172E"/>
         </w:rPr>
-        <w:t>학생 정보는 사역에 꼭 필요한 범위에서만 기록합니다.</w:t>
+        <w:t>크루교사, 임원교사, 보조교사 중 어떤 역할이었는지</w:t>
       </w:r>
     </w:p>
     <w:p>
@@ -3207,7 +3914,7 @@
           <w:rFonts w:ascii="Malgun Gothic" w:hAnsi="Malgun Gothic" w:eastAsia="Malgun Gothic"/>
           <w:color w:val="21172E"/>
         </w:rPr>
-        <w:t>PIN, 서비스 권한 키, 초기 관리자 코드는 문서·단톡방·화면 캡처에 적지 않습니다.</w:t>
+        <w:t>어느 화면에서 어떤 버튼을 어떤 순서로 눌렀는지</w:t>
       </w:r>
     </w:p>
     <w:p>
@@ -3223,7 +3930,7 @@
           <w:rFonts w:ascii="Malgun Gothic" w:hAnsi="Malgun Gothic" w:eastAsia="Malgun Gothic"/>
           <w:color w:val="21172E"/>
         </w:rPr>
-        <w:t>학생은 삭제하지 않고 장기결석 또는 퇴실로 전환해 과거 출석을 보존합니다.</w:t>
+        <w:t>기대한 결과와 실제로 보인 결과</w:t>
       </w:r>
     </w:p>
     <w:p>
@@ -3239,7 +3946,7 @@
           <w:rFonts w:ascii="Malgun Gothic" w:hAnsi="Malgun Gothic" w:eastAsia="Malgun Gothic"/>
           <w:color w:val="21172E"/>
         </w:rPr>
-        <w:t>운영 변경 전에는 기존 출석을 백업하고 이관 전후 건수를 비교합니다.</w:t>
+        <w:t>오류가 발생한 날짜와 대략적인 시각</w:t>
       </w:r>
     </w:p>
     <w:p>
@@ -3255,7 +3962,7 @@
           <w:rFonts w:ascii="Malgun Gothic" w:hAnsi="Malgun Gothic" w:eastAsia="Malgun Gothic"/>
           <w:color w:val="21172E"/>
         </w:rPr>
-        <w:t>공용 컴퓨터와 공용 휴대폰에서는 반드시 로그아웃합니다.</w:t>
+        <w:t>가능하면 휴대폰 기종과 개인정보를 가린 화면 캡처</w:t>
       </w:r>
     </w:p>
     <w:tbl>
@@ -3296,7 +4003,7 @@
                 <w:color w:val="B7791F"/>
                 <w:sz w:val="22"/>
               </w:rPr>
-              <w:t>검토용 초안</w:t>
+              <w:t>긴급 상황</w:t>
             </w:r>
           </w:p>
           <w:p>
@@ -3309,7 +4016,816 @@
                 <w:color w:val="21172E"/>
                 <w:sz w:val="20"/>
               </w:rPr>
-              <w:t>이 문서는 담당 교역자와 임원 검토를 위한 초안입니다. 교사 이름, 크루 배정, 초기 PIN, 운영 시작일은 실제 도입 전에 임원 협의로 확정합니다.</w:t>
+              <w:t>당일 출석 업무를 멈출 수 없으면 임원에게 알리고 종이나 단톡방에 임시 기록한 뒤, 인터넷이 복구되면 시스템에 다시 입력합니다.</w:t>
+            </w:r>
+          </w:p>
+        </w:tc>
+      </w:tr>
+    </w:tbl>
+    <w:p>
+      <w:pPr>
+        <w:spacing w:after="20"/>
+      </w:pPr>
+    </w:p>
+    <w:p>
+      <w:r>
+        <w:br w:type="page"/>
+      </w:r>
+    </w:p>
+    <w:p>
+      <w:pPr>
+        <w:pStyle w:val="Heading1"/>
+      </w:pPr>
+      <w:r>
+        <w:rPr>
+          <w:rFonts w:ascii="Malgun Gothic" w:hAnsi="Malgun Gothic" w:eastAsia="Malgun Gothic"/>
+          <w:b/>
+          <w:color w:val="5B21B6"/>
+          <w:sz w:val="32"/>
+        </w:rPr>
+        <w:t>9. 데스크톱 바로가기와 수정 요청</w:t>
+      </w:r>
+    </w:p>
+    <w:p>
+      <w:pPr>
+        <w:spacing w:after="120" w:line="300" w:lineRule="auto"/>
+        <w:jc w:val="left"/>
+      </w:pPr>
+      <w:r>
+        <w:rPr>
+          <w:rFonts w:ascii="Malgun Gothic" w:hAnsi="Malgun Gothic" w:eastAsia="Malgun Gothic"/>
+          <w:color w:val="21172E"/>
+        </w:rPr>
+        <w:t>데스크톱의 새벽이슬 출석관리 안내 폴더에는 운영 사이트, 이 설명서, 프로그램 관리 폴더, 오류 요청 예시가 함께 있습니다.</w:t>
+      </w:r>
+    </w:p>
+    <w:tbl>
+      <w:tblPr>
+        <w:tblStyle w:val="TableGrid"/>
+        <w:tblW w:type="dxa" w:w="9360"/>
+        <w:tblLayout w:type="fixed"/>
+        <w:tblLook w:firstColumn="1" w:firstRow="1" w:lastColumn="0" w:lastRow="0" w:noHBand="0" w:noVBand="1" w:val="04A0"/>
+        <w:jc w:val="left"/>
+        <w:tblInd w:w="120" w:type="dxa"/>
+      </w:tblPr>
+      <w:tblGrid>
+        <w:gridCol w:w="3180"/>
+        <w:gridCol w:w="6180"/>
+      </w:tblGrid>
+      <w:tr>
+        <w:trPr>
+          <w:tblHeader w:val="true"/>
+        </w:trPr>
+        <w:tc>
+          <w:tcPr>
+            <w:tcW w:type="dxa" w:w="3180"/>
+            <w:tcMar>
+              <w:top w:w="80" w:type="dxa"/>
+              <w:start w:w="120" w:type="dxa"/>
+              <w:bottom w:w="80" w:type="dxa"/>
+              <w:end w:w="120" w:type="dxa"/>
+            </w:tcMar>
+            <w:vAlign w:val="center"/>
+            <w:shd w:fill="E8EEF5"/>
+          </w:tcPr>
+          <w:p>
+            <w:pPr>
+              <w:spacing w:before="0" w:after="0" w:line="276" w:lineRule="auto"/>
+              <w:jc w:val="left"/>
+            </w:pPr>
+            <w:r>
+              <w:rPr>
+                <w:rFonts w:ascii="Malgun Gothic" w:hAnsi="Malgun Gothic" w:eastAsia="Malgun Gothic"/>
+                <w:b/>
+                <w:color w:val="3B0764"/>
+                <w:sz w:val="18"/>
+              </w:rPr>
+              <w:t>데스크톱 항목</w:t>
+            </w:r>
+          </w:p>
+        </w:tc>
+        <w:tc>
+          <w:tcPr>
+            <w:tcW w:type="dxa" w:w="6180"/>
+            <w:tcMar>
+              <w:top w:w="80" w:type="dxa"/>
+              <w:start w:w="120" w:type="dxa"/>
+              <w:bottom w:w="80" w:type="dxa"/>
+              <w:end w:w="120" w:type="dxa"/>
+            </w:tcMar>
+            <w:vAlign w:val="center"/>
+            <w:shd w:fill="E8EEF5"/>
+          </w:tcPr>
+          <w:p>
+            <w:pPr>
+              <w:spacing w:before="0" w:after="0" w:line="276" w:lineRule="auto"/>
+              <w:jc w:val="left"/>
+            </w:pPr>
+            <w:r>
+              <w:rPr>
+                <w:rFonts w:ascii="Malgun Gothic" w:hAnsi="Malgun Gothic" w:eastAsia="Malgun Gothic"/>
+                <w:b/>
+                <w:color w:val="3B0764"/>
+                <w:sz w:val="18"/>
+              </w:rPr>
+              <w:t>용도</w:t>
+            </w:r>
+          </w:p>
+        </w:tc>
+      </w:tr>
+      <w:tr>
+        <w:tc>
+          <w:tcPr>
+            <w:tcW w:type="dxa" w:w="3180"/>
+            <w:tcMar>
+              <w:top w:w="80" w:type="dxa"/>
+              <w:start w:w="120" w:type="dxa"/>
+              <w:bottom w:w="80" w:type="dxa"/>
+              <w:end w:w="120" w:type="dxa"/>
+            </w:tcMar>
+            <w:vAlign w:val="center"/>
+          </w:tcPr>
+          <w:p>
+            <w:pPr>
+              <w:spacing w:before="0" w:after="0" w:line="276" w:lineRule="auto"/>
+              <w:jc w:val="left"/>
+            </w:pPr>
+            <w:r>
+              <w:rPr>
+                <w:rFonts w:ascii="Malgun Gothic" w:hAnsi="Malgun Gothic" w:eastAsia="Malgun Gothic"/>
+                <w:b w:val="0"/>
+                <w:color w:val="21172E"/>
+                <w:sz w:val="18"/>
+              </w:rPr>
+              <w:t>새벽이슬 출석관리</w:t>
+            </w:r>
+          </w:p>
+        </w:tc>
+        <w:tc>
+          <w:tcPr>
+            <w:tcW w:type="dxa" w:w="6180"/>
+            <w:tcMar>
+              <w:top w:w="80" w:type="dxa"/>
+              <w:start w:w="120" w:type="dxa"/>
+              <w:bottom w:w="80" w:type="dxa"/>
+              <w:end w:w="120" w:type="dxa"/>
+            </w:tcMar>
+            <w:vAlign w:val="center"/>
+          </w:tcPr>
+          <w:p>
+            <w:pPr>
+              <w:spacing w:before="0" w:after="0" w:line="276" w:lineRule="auto"/>
+              <w:jc w:val="left"/>
+            </w:pPr>
+            <w:r>
+              <w:rPr>
+                <w:rFonts w:ascii="Malgun Gothic" w:hAnsi="Malgun Gothic" w:eastAsia="Malgun Gothic"/>
+                <w:b w:val="0"/>
+                <w:color w:val="21172E"/>
+                <w:sz w:val="18"/>
+              </w:rPr>
+              <w:t>운영 사이트를 기본 웹 브라우저로 엽니다.</w:t>
+            </w:r>
+          </w:p>
+        </w:tc>
+      </w:tr>
+      <w:tr>
+        <w:tc>
+          <w:tcPr>
+            <w:tcW w:type="dxa" w:w="3180"/>
+            <w:tcMar>
+              <w:top w:w="80" w:type="dxa"/>
+              <w:start w:w="120" w:type="dxa"/>
+              <w:bottom w:w="80" w:type="dxa"/>
+              <w:end w:w="120" w:type="dxa"/>
+            </w:tcMar>
+            <w:vAlign w:val="center"/>
+          </w:tcPr>
+          <w:p>
+            <w:pPr>
+              <w:spacing w:before="0" w:after="0" w:line="276" w:lineRule="auto"/>
+              <w:jc w:val="left"/>
+            </w:pPr>
+            <w:r>
+              <w:rPr>
+                <w:rFonts w:ascii="Malgun Gothic" w:hAnsi="Malgun Gothic" w:eastAsia="Malgun Gothic"/>
+                <w:b w:val="0"/>
+                <w:color w:val="21172E"/>
+                <w:sz w:val="18"/>
+              </w:rPr>
+              <w:t>새벽이슬 출석관리 사용설명서</w:t>
+            </w:r>
+          </w:p>
+        </w:tc>
+        <w:tc>
+          <w:tcPr>
+            <w:tcW w:type="dxa" w:w="6180"/>
+            <w:tcMar>
+              <w:top w:w="80" w:type="dxa"/>
+              <w:start w:w="120" w:type="dxa"/>
+              <w:bottom w:w="80" w:type="dxa"/>
+              <w:end w:w="120" w:type="dxa"/>
+            </w:tcMar>
+            <w:vAlign w:val="center"/>
+          </w:tcPr>
+          <w:p>
+            <w:pPr>
+              <w:spacing w:before="0" w:after="0" w:line="276" w:lineRule="auto"/>
+              <w:jc w:val="left"/>
+            </w:pPr>
+            <w:r>
+              <w:rPr>
+                <w:rFonts w:ascii="Malgun Gothic" w:hAnsi="Malgun Gothic" w:eastAsia="Malgun Gothic"/>
+                <w:b w:val="0"/>
+                <w:color w:val="21172E"/>
+                <w:sz w:val="18"/>
+              </w:rPr>
+              <w:t>교사와 임원이 따라 보는 Word 설명서입니다.</w:t>
+            </w:r>
+          </w:p>
+        </w:tc>
+      </w:tr>
+      <w:tr>
+        <w:tc>
+          <w:tcPr>
+            <w:tcW w:type="dxa" w:w="3180"/>
+            <w:tcMar>
+              <w:top w:w="80" w:type="dxa"/>
+              <w:start w:w="120" w:type="dxa"/>
+              <w:bottom w:w="80" w:type="dxa"/>
+              <w:end w:w="120" w:type="dxa"/>
+            </w:tcMar>
+            <w:vAlign w:val="center"/>
+          </w:tcPr>
+          <w:p>
+            <w:pPr>
+              <w:spacing w:before="0" w:after="0" w:line="276" w:lineRule="auto"/>
+              <w:jc w:val="left"/>
+            </w:pPr>
+            <w:r>
+              <w:rPr>
+                <w:rFonts w:ascii="Malgun Gothic" w:hAnsi="Malgun Gothic" w:eastAsia="Malgun Gothic"/>
+                <w:b w:val="0"/>
+                <w:color w:val="21172E"/>
+                <w:sz w:val="18"/>
+              </w:rPr>
+              <w:t>프로그램 관리 폴더</w:t>
+            </w:r>
+          </w:p>
+        </w:tc>
+        <w:tc>
+          <w:tcPr>
+            <w:tcW w:type="dxa" w:w="6180"/>
+            <w:tcMar>
+              <w:top w:w="80" w:type="dxa"/>
+              <w:start w:w="120" w:type="dxa"/>
+              <w:bottom w:w="80" w:type="dxa"/>
+              <w:end w:w="120" w:type="dxa"/>
+            </w:tcMar>
+            <w:vAlign w:val="center"/>
+          </w:tcPr>
+          <w:p>
+            <w:pPr>
+              <w:spacing w:before="0" w:after="0" w:line="276" w:lineRule="auto"/>
+              <w:jc w:val="left"/>
+            </w:pPr>
+            <w:r>
+              <w:rPr>
+                <w:rFonts w:ascii="Malgun Gothic" w:hAnsi="Malgun Gothic" w:eastAsia="Malgun Gothic"/>
+                <w:b w:val="0"/>
+                <w:color w:val="21172E"/>
+                <w:sz w:val="18"/>
+              </w:rPr>
+              <w:t>코드, 백업, 배포 문서와 미리보기를 엽니다.</w:t>
+            </w:r>
+          </w:p>
+        </w:tc>
+      </w:tr>
+      <w:tr>
+        <w:tc>
+          <w:tcPr>
+            <w:tcW w:type="dxa" w:w="3180"/>
+            <w:tcMar>
+              <w:top w:w="80" w:type="dxa"/>
+              <w:start w:w="120" w:type="dxa"/>
+              <w:bottom w:w="80" w:type="dxa"/>
+              <w:end w:w="120" w:type="dxa"/>
+            </w:tcMar>
+            <w:vAlign w:val="center"/>
+          </w:tcPr>
+          <w:p>
+            <w:pPr>
+              <w:spacing w:before="0" w:after="0" w:line="276" w:lineRule="auto"/>
+              <w:jc w:val="left"/>
+            </w:pPr>
+            <w:r>
+              <w:rPr>
+                <w:rFonts w:ascii="Malgun Gothic" w:hAnsi="Malgun Gothic" w:eastAsia="Malgun Gothic"/>
+                <w:b w:val="0"/>
+                <w:color w:val="21172E"/>
+                <w:sz w:val="18"/>
+              </w:rPr>
+              <w:t>오류·개선 요청 작성 예시</w:t>
+            </w:r>
+          </w:p>
+        </w:tc>
+        <w:tc>
+          <w:tcPr>
+            <w:tcW w:type="dxa" w:w="6180"/>
+            <w:tcMar>
+              <w:top w:w="80" w:type="dxa"/>
+              <w:start w:w="120" w:type="dxa"/>
+              <w:bottom w:w="80" w:type="dxa"/>
+              <w:end w:w="120" w:type="dxa"/>
+            </w:tcMar>
+            <w:vAlign w:val="center"/>
+          </w:tcPr>
+          <w:p>
+            <w:pPr>
+              <w:spacing w:before="0" w:after="0" w:line="276" w:lineRule="auto"/>
+              <w:jc w:val="left"/>
+            </w:pPr>
+            <w:r>
+              <w:rPr>
+                <w:rFonts w:ascii="Malgun Gothic" w:hAnsi="Malgun Gothic" w:eastAsia="Malgun Gothic"/>
+                <w:b w:val="0"/>
+                <w:color w:val="21172E"/>
+                <w:sz w:val="18"/>
+              </w:rPr>
+              <w:t>Codex에 전달할 내용을 빠뜨리지 않도록 도와줍니다.</w:t>
+            </w:r>
+          </w:p>
+        </w:tc>
+      </w:tr>
+    </w:tbl>
+    <w:p>
+      <w:pPr>
+        <w:spacing w:after="20"/>
+      </w:pPr>
+    </w:p>
+    <w:p>
+      <w:pPr>
+        <w:pStyle w:val="Heading2"/>
+      </w:pPr>
+      <w:r>
+        <w:rPr>
+          <w:rFonts w:ascii="Malgun Gothic" w:hAnsi="Malgun Gothic" w:eastAsia="Malgun Gothic"/>
+          <w:b/>
+          <w:color w:val="5B21B6"/>
+          <w:sz w:val="26"/>
+        </w:rPr>
+        <w:t>수정을 요청하는 가장 쉬운 순서</w:t>
+      </w:r>
+    </w:p>
+    <w:p>
+      <w:pPr>
+        <w:numPr>
+          <w:ilvl w:val="0"/>
+          <w:numId w:val="10"/>
+        </w:numPr>
+        <w:spacing w:after="80" w:line="300" w:lineRule="auto"/>
+      </w:pPr>
+      <w:r>
+        <w:rPr>
+          <w:rFonts w:ascii="Malgun Gothic" w:hAnsi="Malgun Gothic" w:eastAsia="Malgun Gothic"/>
+          <w:color w:val="21172E"/>
+        </w:rPr>
+        <w:t>사이트의 오류·개선 의견 보내기로 현장 의견을 접수합니다.</w:t>
+      </w:r>
+    </w:p>
+    <w:p>
+      <w:pPr>
+        <w:numPr>
+          <w:ilvl w:val="0"/>
+          <w:numId w:val="10"/>
+        </w:numPr>
+        <w:spacing w:after="80" w:line="300" w:lineRule="auto"/>
+      </w:pPr>
+      <w:r>
+        <w:rPr>
+          <w:rFonts w:ascii="Malgun Gothic" w:hAnsi="Malgun Gothic" w:eastAsia="Malgun Gothic"/>
+          <w:color w:val="21172E"/>
+        </w:rPr>
+        <w:t>임원 의견함에서 새 의견을 확인 중으로 변경합니다.</w:t>
+      </w:r>
+    </w:p>
+    <w:p>
+      <w:pPr>
+        <w:numPr>
+          <w:ilvl w:val="0"/>
+          <w:numId w:val="10"/>
+        </w:numPr>
+        <w:spacing w:after="80" w:line="300" w:lineRule="auto"/>
+      </w:pPr>
+      <w:r>
+        <w:rPr>
+          <w:rFonts w:ascii="Malgun Gothic" w:hAnsi="Malgun Gothic" w:eastAsia="Malgun Gothic"/>
+          <w:color w:val="21172E"/>
+        </w:rPr>
+        <w:t>이 Codex 대화에서 새벽이슬 출석관리에서 원하는 내용을 수정해 달라고 요청합니다.</w:t>
+      </w:r>
+    </w:p>
+    <w:p>
+      <w:pPr>
+        <w:numPr>
+          <w:ilvl w:val="0"/>
+          <w:numId w:val="10"/>
+        </w:numPr>
+        <w:spacing w:after="80" w:line="300" w:lineRule="auto"/>
+      </w:pPr>
+      <w:r>
+        <w:rPr>
+          <w:rFonts w:ascii="Malgun Gothic" w:hAnsi="Malgun Gothic" w:eastAsia="Malgun Gothic"/>
+          <w:color w:val="21172E"/>
+        </w:rPr>
+        <w:t>개발_미리보기_실행.bat으로 데모 화면을 확인합니다. 데모 접속 정보는 관리 폴더의 유지보수 가이드에서 확인합니다.</w:t>
+      </w:r>
+    </w:p>
+    <w:p>
+      <w:pPr>
+        <w:numPr>
+          <w:ilvl w:val="0"/>
+          <w:numId w:val="10"/>
+        </w:numPr>
+        <w:spacing w:after="80" w:line="300" w:lineRule="auto"/>
+      </w:pPr>
+      <w:r>
+        <w:rPr>
+          <w:rFonts w:ascii="Malgun Gothic" w:hAnsi="Malgun Gothic" w:eastAsia="Malgun Gothic"/>
+          <w:color w:val="21172E"/>
+        </w:rPr>
+        <w:t>테스트에 통과한 변경만 운영 사이트에 배포합니다.</w:t>
+      </w:r>
+    </w:p>
+    <w:p>
+      <w:pPr>
+        <w:numPr>
+          <w:ilvl w:val="0"/>
+          <w:numId w:val="10"/>
+        </w:numPr>
+        <w:spacing w:after="80" w:line="300" w:lineRule="auto"/>
+      </w:pPr>
+      <w:r>
+        <w:rPr>
+          <w:rFonts w:ascii="Malgun Gothic" w:hAnsi="Malgun Gothic" w:eastAsia="Malgun Gothic"/>
+          <w:color w:val="21172E"/>
+        </w:rPr>
+        <w:t>현장 확인 후 의견 상태를 완료로 변경합니다.</w:t>
+      </w:r>
+    </w:p>
+    <w:tbl>
+      <w:tblPr>
+        <w:tblW w:type="dxa" w:w="9360"/>
+        <w:jc w:val="left"/>
+        <w:tblLayout w:type="fixed"/>
+        <w:tblLook w:firstColumn="1" w:firstRow="1" w:lastColumn="0" w:lastRow="0" w:noHBand="0" w:noVBand="1" w:val="04A0"/>
+        <w:tblInd w:w="120" w:type="dxa"/>
+      </w:tblPr>
+      <w:tblGrid>
+        <w:gridCol w:w="9360"/>
+      </w:tblGrid>
+      <w:tr>
+        <w:trPr>
+          <w:tblHeader w:val="true"/>
+        </w:trPr>
+        <w:tc>
+          <w:tcPr>
+            <w:tcW w:type="dxa" w:w="9360"/>
+            <w:tcMar>
+              <w:top w:w="80" w:type="dxa"/>
+              <w:start w:w="120" w:type="dxa"/>
+              <w:bottom w:w="80" w:type="dxa"/>
+              <w:end w:w="120" w:type="dxa"/>
+            </w:tcMar>
+            <w:vAlign w:val="center"/>
+            <w:shd w:fill="F1EAFE"/>
+          </w:tcPr>
+          <w:p>
+            <w:pPr>
+              <w:spacing w:after="80"/>
+            </w:pPr>
+            <w:r>
+              <w:rPr>
+                <w:rFonts w:ascii="Malgun Gothic" w:hAnsi="Malgun Gothic" w:eastAsia="Malgun Gothic"/>
+                <w:b/>
+                <w:color w:val="5B21B6"/>
+                <w:sz w:val="22"/>
+              </w:rPr>
+              <w:t>운영 데이터 보호</w:t>
+            </w:r>
+          </w:p>
+          <w:p>
+            <w:pPr>
+              <w:spacing w:after="0" w:line="288" w:lineRule="auto"/>
+            </w:pPr>
+            <w:r>
+              <w:rPr>
+                <w:rFonts w:ascii="Malgun Gothic" w:hAnsi="Malgun Gothic" w:eastAsia="Malgun Gothic"/>
+                <w:color w:val="21172E"/>
+                <w:sz w:val="20"/>
+              </w:rPr>
+              <w:t>미리보기의 데모 데이터와 실제 Supabase 운영 데이터를 구분해 검사합니다. 데이터 구조 변경 전에는 반드시 기존 출석을 백업합니다.</w:t>
+            </w:r>
+          </w:p>
+        </w:tc>
+      </w:tr>
+    </w:tbl>
+    <w:p>
+      <w:pPr>
+        <w:spacing w:after="20"/>
+      </w:pPr>
+    </w:p>
+    <w:p>
+      <w:r>
+        <w:br w:type="page"/>
+      </w:r>
+    </w:p>
+    <w:p>
+      <w:pPr>
+        <w:pStyle w:val="Heading1"/>
+      </w:pPr>
+      <w:r>
+        <w:rPr>
+          <w:rFonts w:ascii="Malgun Gothic" w:hAnsi="Malgun Gothic" w:eastAsia="Malgun Gothic"/>
+          <w:b/>
+          <w:color w:val="5B21B6"/>
+          <w:sz w:val="32"/>
+        </w:rPr>
+        <w:t>10. 운영 체크리스트</w:t>
+      </w:r>
+    </w:p>
+    <w:p>
+      <w:pPr>
+        <w:pStyle w:val="Heading2"/>
+      </w:pPr>
+      <w:r>
+        <w:rPr>
+          <w:rFonts w:ascii="Malgun Gothic" w:hAnsi="Malgun Gothic" w:eastAsia="Malgun Gothic"/>
+          <w:b/>
+          <w:color w:val="5B21B6"/>
+          <w:sz w:val="26"/>
+        </w:rPr>
+        <w:t>출석체크를 마치기 전</w:t>
+      </w:r>
+    </w:p>
+    <w:p>
+      <w:pPr>
+        <w:numPr>
+          <w:ilvl w:val="0"/>
+          <w:numId w:val="11"/>
+        </w:numPr>
+        <w:spacing w:after="80" w:line="300" w:lineRule="auto"/>
+      </w:pPr>
+      <w:r>
+        <w:rPr>
+          <w:rFonts w:ascii="Malgun Gothic" w:hAnsi="Malgun Gothic" w:eastAsia="Malgun Gothic"/>
+          <w:color w:val="21172E"/>
+        </w:rPr>
+        <w:t>화면 상단의 날짜와 크루명이 올바르다.</w:t>
+      </w:r>
+    </w:p>
+    <w:p>
+      <w:pPr>
+        <w:numPr>
+          <w:ilvl w:val="0"/>
+          <w:numId w:val="11"/>
+        </w:numPr>
+        <w:spacing w:after="80" w:line="300" w:lineRule="auto"/>
+      </w:pPr>
+      <w:r>
+        <w:rPr>
+          <w:rFonts w:ascii="Malgun Gothic" w:hAnsi="Malgun Gothic" w:eastAsia="Malgun Gothic"/>
+          <w:color w:val="21172E"/>
+        </w:rPr>
+        <w:t>모든 학생이 출석 또는 결석으로 체크되었다.</w:t>
+      </w:r>
+    </w:p>
+    <w:p>
+      <w:pPr>
+        <w:numPr>
+          <w:ilvl w:val="0"/>
+          <w:numId w:val="11"/>
+        </w:numPr>
+        <w:spacing w:after="80" w:line="300" w:lineRule="auto"/>
+      </w:pPr>
+      <w:r>
+        <w:rPr>
+          <w:rFonts w:ascii="Malgun Gothic" w:hAnsi="Malgun Gothic" w:eastAsia="Malgun Gothic"/>
+          <w:color w:val="21172E"/>
+        </w:rPr>
+        <w:t>결석 학생의 사유와 연락 상태를 필요한 만큼 입력했다.</w:t>
+      </w:r>
+    </w:p>
+    <w:p>
+      <w:pPr>
+        <w:numPr>
+          <w:ilvl w:val="0"/>
+          <w:numId w:val="11"/>
+        </w:numPr>
+        <w:spacing w:after="80" w:line="300" w:lineRule="auto"/>
+      </w:pPr>
+      <w:r>
+        <w:rPr>
+          <w:rFonts w:ascii="Malgun Gothic" w:hAnsi="Malgun Gothic" w:eastAsia="Malgun Gothic"/>
+          <w:color w:val="21172E"/>
+        </w:rPr>
+        <w:t>임원이 요청한 임시 확인 항목을 빠뜨리지 않았다.</w:t>
+      </w:r>
+    </w:p>
+    <w:p>
+      <w:pPr>
+        <w:numPr>
+          <w:ilvl w:val="0"/>
+          <w:numId w:val="11"/>
+        </w:numPr>
+        <w:spacing w:after="80" w:line="300" w:lineRule="auto"/>
+      </w:pPr>
+      <w:r>
+        <w:rPr>
+          <w:rFonts w:ascii="Malgun Gothic" w:hAnsi="Malgun Gothic" w:eastAsia="Malgun Gothic"/>
+          <w:color w:val="21172E"/>
+        </w:rPr>
+        <w:t>저장 실패 또는 인터넷 연결 경고가 없다.</w:t>
+      </w:r>
+    </w:p>
+    <w:p>
+      <w:pPr>
+        <w:numPr>
+          <w:ilvl w:val="0"/>
+          <w:numId w:val="11"/>
+        </w:numPr>
+        <w:spacing w:after="80" w:line="300" w:lineRule="auto"/>
+      </w:pPr>
+      <w:r>
+        <w:rPr>
+          <w:rFonts w:ascii="Malgun Gothic" w:hAnsi="Malgun Gothic" w:eastAsia="Malgun Gothic"/>
+          <w:color w:val="21172E"/>
+        </w:rPr>
+        <w:t>보고 문구를 복사해 필요한 곳에 보고했다.</w:t>
+      </w:r>
+    </w:p>
+    <w:p>
+      <w:pPr>
+        <w:pStyle w:val="Heading2"/>
+      </w:pPr>
+      <w:r>
+        <w:rPr>
+          <w:rFonts w:ascii="Malgun Gothic" w:hAnsi="Malgun Gothic" w:eastAsia="Malgun Gothic"/>
+          <w:b/>
+          <w:color w:val="5B21B6"/>
+          <w:sz w:val="26"/>
+        </w:rPr>
+        <w:t>임원이 주기적으로 확인할 것</w:t>
+      </w:r>
+    </w:p>
+    <w:p>
+      <w:pPr>
+        <w:numPr>
+          <w:ilvl w:val="0"/>
+          <w:numId w:val="11"/>
+        </w:numPr>
+        <w:spacing w:after="80" w:line="300" w:lineRule="auto"/>
+      </w:pPr>
+      <w:r>
+        <w:rPr>
+          <w:rFonts w:ascii="Malgun Gothic" w:hAnsi="Malgun Gothic" w:eastAsia="Malgun Gothic"/>
+          <w:color w:val="21172E"/>
+        </w:rPr>
+        <w:t>확인 필요 표시가 있는 학생과 연락 안 됨 학생</w:t>
+      </w:r>
+    </w:p>
+    <w:p>
+      <w:pPr>
+        <w:numPr>
+          <w:ilvl w:val="0"/>
+          <w:numId w:val="11"/>
+        </w:numPr>
+        <w:spacing w:after="80" w:line="300" w:lineRule="auto"/>
+      </w:pPr>
+      <w:r>
+        <w:rPr>
+          <w:rFonts w:ascii="Malgun Gothic" w:hAnsi="Malgun Gothic" w:eastAsia="Malgun Gothic"/>
+          <w:color w:val="21172E"/>
+        </w:rPr>
+        <w:t>학생 비고의 장학금·상담·특별 보고사항</w:t>
+      </w:r>
+    </w:p>
+    <w:p>
+      <w:pPr>
+        <w:numPr>
+          <w:ilvl w:val="0"/>
+          <w:numId w:val="11"/>
+        </w:numPr>
+        <w:spacing w:after="80" w:line="300" w:lineRule="auto"/>
+      </w:pPr>
+      <w:r>
+        <w:rPr>
+          <w:rFonts w:ascii="Malgun Gothic" w:hAnsi="Malgun Gothic" w:eastAsia="Malgun Gothic"/>
+          <w:color w:val="21172E"/>
+        </w:rPr>
+        <w:t>공지와 임시 확인 항목의 종료일</w:t>
+      </w:r>
+    </w:p>
+    <w:p>
+      <w:pPr>
+        <w:numPr>
+          <w:ilvl w:val="0"/>
+          <w:numId w:val="11"/>
+        </w:numPr>
+        <w:spacing w:after="80" w:line="300" w:lineRule="auto"/>
+      </w:pPr>
+      <w:r>
+        <w:rPr>
+          <w:rFonts w:ascii="Malgun Gothic" w:hAnsi="Malgun Gothic" w:eastAsia="Malgun Gothic"/>
+          <w:color w:val="21172E"/>
+        </w:rPr>
+        <w:t>새 오류·개선 의견과 처리 상태</w:t>
+      </w:r>
+    </w:p>
+    <w:p>
+      <w:pPr>
+        <w:numPr>
+          <w:ilvl w:val="0"/>
+          <w:numId w:val="11"/>
+        </w:numPr>
+        <w:spacing w:after="80" w:line="300" w:lineRule="auto"/>
+      </w:pPr>
+      <w:r>
+        <w:rPr>
+          <w:rFonts w:ascii="Malgun Gothic" w:hAnsi="Malgun Gothic" w:eastAsia="Malgun Gothic"/>
+          <w:color w:val="21172E"/>
+        </w:rPr>
+        <w:t>비활성 교사, 종료 크루, 장기결석·퇴실 학생 정리</w:t>
+      </w:r>
+    </w:p>
+    <w:p>
+      <w:pPr>
+        <w:numPr>
+          <w:ilvl w:val="0"/>
+          <w:numId w:val="11"/>
+        </w:numPr>
+        <w:spacing w:after="80" w:line="300" w:lineRule="auto"/>
+      </w:pPr>
+      <w:r>
+        <w:rPr>
+          <w:rFonts w:ascii="Malgun Gothic" w:hAnsi="Malgun Gothic" w:eastAsia="Malgun Gothic"/>
+          <w:color w:val="21172E"/>
+        </w:rPr>
+        <w:t>CSV 내보내기와 기존 출석 건수의 이상 여부</w:t>
+      </w:r>
+    </w:p>
+    <w:tbl>
+      <w:tblPr>
+        <w:tblW w:type="dxa" w:w="9360"/>
+        <w:jc w:val="left"/>
+        <w:tblLayout w:type="fixed"/>
+        <w:tblLook w:firstColumn="1" w:firstRow="1" w:lastColumn="0" w:lastRow="0" w:noHBand="0" w:noVBand="1" w:val="04A0"/>
+        <w:tblInd w:w="120" w:type="dxa"/>
+      </w:tblPr>
+      <w:tblGrid>
+        <w:gridCol w:w="9360"/>
+      </w:tblGrid>
+      <w:tr>
+        <w:trPr>
+          <w:tblHeader w:val="true"/>
+        </w:trPr>
+        <w:tc>
+          <w:tcPr>
+            <w:tcW w:type="dxa" w:w="9360"/>
+            <w:tcMar>
+              <w:top w:w="80" w:type="dxa"/>
+              <w:start w:w="120" w:type="dxa"/>
+              <w:bottom w:w="80" w:type="dxa"/>
+              <w:end w:w="120" w:type="dxa"/>
+            </w:tcMar>
+            <w:vAlign w:val="center"/>
+            <w:shd w:fill="FFF8E6"/>
+          </w:tcPr>
+          <w:p>
+            <w:pPr>
+              <w:spacing w:after="80"/>
+            </w:pPr>
+            <w:r>
+              <w:rPr>
+                <w:rFonts w:ascii="Malgun Gothic" w:hAnsi="Malgun Gothic" w:eastAsia="Malgun Gothic"/>
+                <w:b/>
+                <w:color w:val="B7791F"/>
+                <w:sz w:val="22"/>
+              </w:rPr>
+              <w:t>마지막 확인</w:t>
+            </w:r>
+          </w:p>
+          <w:p>
+            <w:pPr>
+              <w:spacing w:after="0" w:line="288" w:lineRule="auto"/>
+            </w:pPr>
+            <w:r>
+              <w:rPr>
+                <w:rFonts w:ascii="Malgun Gothic" w:hAnsi="Malgun Gothic" w:eastAsia="Malgun Gothic"/>
+                <w:color w:val="21172E"/>
+                <w:sz w:val="20"/>
+              </w:rPr>
+              <w:t>공용 기기라면 로그아웃합니다. 개인 기기에서는 자동 로그인을 이용하되, 다른 사람에게 기기를 빌려줄 때는 먼저 로그아웃합니다.</w:t>
             </w:r>
           </w:p>
         </w:tc>
@@ -3600,8 +5116,8 @@
     <w:multiLevelType w:val="singleLevel"/>
     <w:lvl w:ilvl="0">
       <w:start w:val="1"/>
-      <w:numFmt w:val="decimal"/>
-      <w:lvlText w:val="%1."/>
+      <w:numFmt w:val="bullet"/>
+      <w:lvlText w:val="•"/>
       <w:lvlJc w:val="left"/>
       <w:pPr>
         <w:tabs>

</xml_diff>

<commit_message>
feat: add installable mobile and desktop app
</commit_message>
<xml_diff>
--- a/docs/새벽이슬_출석관리_사용설명서.docx
+++ b/docs/새벽이슬_출석관리_사용설명서.docx
@@ -225,7 +225,7 @@
                 <w:color w:val="21172E"/>
                 <w:sz w:val="20"/>
               </w:rPr>
-              <w:t>데스크톱의 새벽이슬 출석관리 바로가기를 더블클릭합니다. 설명서와 관리 파일은 새벽이슬 출석관리 안내 폴더에서 엽니다. 휴대폰에서는 운영 주소를 즐겨찾기 또는 홈 화면에 추가합니다.</w:t>
+              <w:t>운영 사이트를 연 뒤 화면 왼쪽 아래의 앱 설치를 누릅니다. 설치가 끝나면 휴대폰 홈 화면이나 컴퓨터 바탕 화면·시작 메뉴의 새벽이슬 아이콘으로 바로 실행할 수 있습니다.</w:t>
             </w:r>
           </w:p>
         </w:tc>
@@ -797,6 +797,426 @@
       </w:r>
     </w:p>
     <w:p>
+      <w:r>
+        <w:br w:type="page"/>
+      </w:r>
+    </w:p>
+    <w:p>
+      <w:pPr>
+        <w:pStyle w:val="Heading2"/>
+      </w:pPr>
+      <w:r>
+        <w:rPr>
+          <w:rFonts w:ascii="Malgun Gothic" w:hAnsi="Malgun Gothic" w:eastAsia="Malgun Gothic"/>
+          <w:b/>
+          <w:color w:val="5B21B6"/>
+          <w:sz w:val="26"/>
+        </w:rPr>
+        <w:t>휴대폰·컴퓨터에 앱처럼 설치하기</w:t>
+      </w:r>
+    </w:p>
+    <w:p>
+      <w:pPr>
+        <w:spacing w:after="120" w:line="300" w:lineRule="auto"/>
+        <w:jc w:val="left"/>
+      </w:pPr>
+      <w:r>
+        <w:rPr>
+          <w:rFonts w:ascii="Malgun Gothic" w:hAnsi="Malgun Gothic" w:eastAsia="Malgun Gothic"/>
+          <w:color w:val="21172E"/>
+        </w:rPr>
+        <w:t>화면 왼쪽 아래의 앱 설치 버튼을 누르면 현재 기기에 맞는 순서가 큰 글씨로 표시됩니다. 설치 후에는 주소를 다시 찾지 않고 새벽이슬 아이콘으로 출석관리를 바로 열 수 있습니다.</w:t>
+      </w:r>
+    </w:p>
+    <w:tbl>
+      <w:tblPr>
+        <w:tblStyle w:val="TableGrid"/>
+        <w:tblW w:type="dxa" w:w="9360"/>
+        <w:tblLayout w:type="fixed"/>
+        <w:tblLook w:firstColumn="1" w:firstRow="1" w:lastColumn="0" w:lastRow="0" w:noHBand="0" w:noVBand="1" w:val="04A0"/>
+        <w:jc w:val="left"/>
+        <w:tblInd w:w="120" w:type="dxa"/>
+      </w:tblPr>
+      <w:tblGrid>
+        <w:gridCol w:w="2160"/>
+        <w:gridCol w:w="7200"/>
+      </w:tblGrid>
+      <w:tr>
+        <w:trPr>
+          <w:tblHeader w:val="true"/>
+        </w:trPr>
+        <w:tc>
+          <w:tcPr>
+            <w:tcW w:type="dxa" w:w="2160"/>
+            <w:tcMar>
+              <w:top w:w="80" w:type="dxa"/>
+              <w:start w:w="120" w:type="dxa"/>
+              <w:bottom w:w="80" w:type="dxa"/>
+              <w:end w:w="120" w:type="dxa"/>
+            </w:tcMar>
+            <w:vAlign w:val="center"/>
+            <w:shd w:fill="E8EEF5"/>
+          </w:tcPr>
+          <w:p>
+            <w:pPr>
+              <w:spacing w:before="0" w:after="0" w:line="276" w:lineRule="auto"/>
+              <w:jc w:val="left"/>
+            </w:pPr>
+            <w:r>
+              <w:rPr>
+                <w:rFonts w:ascii="Malgun Gothic" w:hAnsi="Malgun Gothic" w:eastAsia="Malgun Gothic"/>
+                <w:b/>
+                <w:color w:val="3B0764"/>
+                <w:sz w:val="18"/>
+              </w:rPr>
+              <w:t>기기</w:t>
+            </w:r>
+          </w:p>
+        </w:tc>
+        <w:tc>
+          <w:tcPr>
+            <w:tcW w:type="dxa" w:w="7200"/>
+            <w:tcMar>
+              <w:top w:w="80" w:type="dxa"/>
+              <w:start w:w="120" w:type="dxa"/>
+              <w:bottom w:w="80" w:type="dxa"/>
+              <w:end w:w="120" w:type="dxa"/>
+            </w:tcMar>
+            <w:vAlign w:val="center"/>
+            <w:shd w:fill="E8EEF5"/>
+          </w:tcPr>
+          <w:p>
+            <w:pPr>
+              <w:spacing w:before="0" w:after="0" w:line="276" w:lineRule="auto"/>
+              <w:jc w:val="left"/>
+            </w:pPr>
+            <w:r>
+              <w:rPr>
+                <w:rFonts w:ascii="Malgun Gothic" w:hAnsi="Malgun Gothic" w:eastAsia="Malgun Gothic"/>
+                <w:b/>
+                <w:color w:val="3B0764"/>
+                <w:sz w:val="18"/>
+              </w:rPr>
+              <w:t>설치 순서</w:t>
+            </w:r>
+          </w:p>
+        </w:tc>
+      </w:tr>
+      <w:tr>
+        <w:tc>
+          <w:tcPr>
+            <w:tcW w:type="dxa" w:w="2160"/>
+            <w:tcMar>
+              <w:top w:w="80" w:type="dxa"/>
+              <w:start w:w="120" w:type="dxa"/>
+              <w:bottom w:w="80" w:type="dxa"/>
+              <w:end w:w="120" w:type="dxa"/>
+            </w:tcMar>
+            <w:vAlign w:val="center"/>
+          </w:tcPr>
+          <w:p>
+            <w:pPr>
+              <w:spacing w:before="0" w:after="0" w:line="276" w:lineRule="auto"/>
+              <w:jc w:val="left"/>
+            </w:pPr>
+            <w:r>
+              <w:rPr>
+                <w:rFonts w:ascii="Malgun Gothic" w:hAnsi="Malgun Gothic" w:eastAsia="Malgun Gothic"/>
+                <w:b w:val="0"/>
+                <w:color w:val="21172E"/>
+                <w:sz w:val="18"/>
+              </w:rPr>
+              <w:t>안드로이드</w:t>
+            </w:r>
+          </w:p>
+        </w:tc>
+        <w:tc>
+          <w:tcPr>
+            <w:tcW w:type="dxa" w:w="7200"/>
+            <w:tcMar>
+              <w:top w:w="80" w:type="dxa"/>
+              <w:start w:w="120" w:type="dxa"/>
+              <w:bottom w:w="80" w:type="dxa"/>
+              <w:end w:w="120" w:type="dxa"/>
+            </w:tcMar>
+            <w:vAlign w:val="center"/>
+          </w:tcPr>
+          <w:p>
+            <w:pPr>
+              <w:spacing w:before="0" w:after="0" w:line="276" w:lineRule="auto"/>
+              <w:jc w:val="left"/>
+            </w:pPr>
+            <w:r>
+              <w:rPr>
+                <w:rFonts w:ascii="Malgun Gothic" w:hAnsi="Malgun Gothic" w:eastAsia="Malgun Gothic"/>
+                <w:b w:val="0"/>
+                <w:color w:val="21172E"/>
+                <w:sz w:val="18"/>
+              </w:rPr>
+              <w:t>Chrome 또는 Samsung Internet에서 앱 설치를 누릅니다. 자동 버튼이 없으면 브라우저 메뉴의 앱 설치 또는 홈 화면에 추가를 선택합니다.</w:t>
+            </w:r>
+          </w:p>
+        </w:tc>
+      </w:tr>
+      <w:tr>
+        <w:tc>
+          <w:tcPr>
+            <w:tcW w:type="dxa" w:w="2160"/>
+            <w:tcMar>
+              <w:top w:w="80" w:type="dxa"/>
+              <w:start w:w="120" w:type="dxa"/>
+              <w:bottom w:w="80" w:type="dxa"/>
+              <w:end w:w="120" w:type="dxa"/>
+            </w:tcMar>
+            <w:vAlign w:val="center"/>
+          </w:tcPr>
+          <w:p>
+            <w:pPr>
+              <w:spacing w:before="0" w:after="0" w:line="276" w:lineRule="auto"/>
+              <w:jc w:val="left"/>
+            </w:pPr>
+            <w:r>
+              <w:rPr>
+                <w:rFonts w:ascii="Malgun Gothic" w:hAnsi="Malgun Gothic" w:eastAsia="Malgun Gothic"/>
+                <w:b w:val="0"/>
+                <w:color w:val="21172E"/>
+                <w:sz w:val="18"/>
+              </w:rPr>
+              <w:t>아이폰·아이패드</w:t>
+            </w:r>
+          </w:p>
+        </w:tc>
+        <w:tc>
+          <w:tcPr>
+            <w:tcW w:type="dxa" w:w="7200"/>
+            <w:tcMar>
+              <w:top w:w="80" w:type="dxa"/>
+              <w:start w:w="120" w:type="dxa"/>
+              <w:bottom w:w="80" w:type="dxa"/>
+              <w:end w:w="120" w:type="dxa"/>
+            </w:tcMar>
+            <w:vAlign w:val="center"/>
+          </w:tcPr>
+          <w:p>
+            <w:pPr>
+              <w:spacing w:before="0" w:after="0" w:line="276" w:lineRule="auto"/>
+              <w:jc w:val="left"/>
+            </w:pPr>
+            <w:r>
+              <w:rPr>
+                <w:rFonts w:ascii="Malgun Gothic" w:hAnsi="Malgun Gothic" w:eastAsia="Malgun Gothic"/>
+                <w:b w:val="0"/>
+                <w:color w:val="21172E"/>
+                <w:sz w:val="18"/>
+              </w:rPr>
+              <w:t>Safari에서 공유를 누른 뒤 홈 화면에 추가, 추가 순서로 누릅니다.</w:t>
+            </w:r>
+          </w:p>
+        </w:tc>
+      </w:tr>
+      <w:tr>
+        <w:tc>
+          <w:tcPr>
+            <w:tcW w:type="dxa" w:w="2160"/>
+            <w:tcMar>
+              <w:top w:w="80" w:type="dxa"/>
+              <w:start w:w="120" w:type="dxa"/>
+              <w:bottom w:w="80" w:type="dxa"/>
+              <w:end w:w="120" w:type="dxa"/>
+            </w:tcMar>
+            <w:vAlign w:val="center"/>
+          </w:tcPr>
+          <w:p>
+            <w:pPr>
+              <w:spacing w:before="0" w:after="0" w:line="276" w:lineRule="auto"/>
+              <w:jc w:val="left"/>
+            </w:pPr>
+            <w:r>
+              <w:rPr>
+                <w:rFonts w:ascii="Malgun Gothic" w:hAnsi="Malgun Gothic" w:eastAsia="Malgun Gothic"/>
+                <w:b w:val="0"/>
+                <w:color w:val="21172E"/>
+                <w:sz w:val="18"/>
+              </w:rPr>
+              <w:t>Windows·Mac</w:t>
+            </w:r>
+          </w:p>
+        </w:tc>
+        <w:tc>
+          <w:tcPr>
+            <w:tcW w:type="dxa" w:w="7200"/>
+            <w:tcMar>
+              <w:top w:w="80" w:type="dxa"/>
+              <w:start w:w="120" w:type="dxa"/>
+              <w:bottom w:w="80" w:type="dxa"/>
+              <w:end w:w="120" w:type="dxa"/>
+            </w:tcMar>
+            <w:vAlign w:val="center"/>
+          </w:tcPr>
+          <w:p>
+            <w:pPr>
+              <w:spacing w:before="0" w:after="0" w:line="276" w:lineRule="auto"/>
+              <w:jc w:val="left"/>
+            </w:pPr>
+            <w:r>
+              <w:rPr>
+                <w:rFonts w:ascii="Malgun Gothic" w:hAnsi="Malgun Gothic" w:eastAsia="Malgun Gothic"/>
+                <w:b w:val="0"/>
+                <w:color w:val="21172E"/>
+                <w:sz w:val="18"/>
+              </w:rPr>
+              <w:t>Chrome 또는 Edge 주소창의 설치 아이콘을 누릅니다. 아이콘이 없으면 브라우저 메뉴에서 앱 설치를 선택합니다.</w:t>
+            </w:r>
+          </w:p>
+        </w:tc>
+      </w:tr>
+    </w:tbl>
+    <w:p>
+      <w:pPr>
+        <w:spacing w:after="20"/>
+      </w:pPr>
+    </w:p>
+    <w:tbl>
+      <w:tblPr>
+        <w:tblW w:type="dxa" w:w="9360"/>
+        <w:jc w:val="left"/>
+        <w:tblLayout w:type="fixed"/>
+        <w:tblLook w:firstColumn="1" w:firstRow="1" w:lastColumn="0" w:lastRow="0" w:noHBand="0" w:noVBand="1" w:val="04A0"/>
+        <w:tblInd w:w="120" w:type="dxa"/>
+      </w:tblPr>
+      <w:tblGrid>
+        <w:gridCol w:w="9360"/>
+      </w:tblGrid>
+      <w:tr>
+        <w:trPr>
+          <w:tblHeader w:val="true"/>
+        </w:trPr>
+        <w:tc>
+          <w:tcPr>
+            <w:tcW w:type="dxa" w:w="9360"/>
+            <w:tcMar>
+              <w:top w:w="80" w:type="dxa"/>
+              <w:start w:w="120" w:type="dxa"/>
+              <w:bottom w:w="80" w:type="dxa"/>
+              <w:end w:w="120" w:type="dxa"/>
+            </w:tcMar>
+            <w:vAlign w:val="center"/>
+            <w:shd w:fill="FFF8E6"/>
+          </w:tcPr>
+          <w:p>
+            <w:pPr>
+              <w:spacing w:after="80"/>
+            </w:pPr>
+            <w:r>
+              <w:rPr>
+                <w:rFonts w:ascii="Malgun Gothic" w:hAnsi="Malgun Gothic" w:eastAsia="Malgun Gothic"/>
+                <w:b/>
+                <w:color w:val="B7791F"/>
+                <w:sz w:val="22"/>
+              </w:rPr>
+              <w:t>카카오톡에서 링크를 연 경우</w:t>
+            </w:r>
+          </w:p>
+          <w:p>
+            <w:pPr>
+              <w:spacing w:after="0" w:line="288" w:lineRule="auto"/>
+            </w:pPr>
+            <w:r>
+              <w:rPr>
+                <w:rFonts w:ascii="Malgun Gothic" w:hAnsi="Malgun Gothic" w:eastAsia="Malgun Gothic"/>
+                <w:color w:val="21172E"/>
+                <w:sz w:val="20"/>
+              </w:rPr>
+              <w:t>카카오톡 안에서는 설치가 제한될 수 있습니다. 우측 상단 메뉴에서 다른 브라우저로 열기를 선택한 뒤 위 순서대로 설치합니다.</w:t>
+            </w:r>
+          </w:p>
+        </w:tc>
+      </w:tr>
+    </w:tbl>
+    <w:p>
+      <w:pPr>
+        <w:spacing w:after="20"/>
+      </w:pPr>
+    </w:p>
+    <w:p>
+      <w:pPr>
+        <w:pStyle w:val="Heading2"/>
+      </w:pPr>
+      <w:r>
+        <w:rPr>
+          <w:rFonts w:ascii="Malgun Gothic" w:hAnsi="Malgun Gothic" w:eastAsia="Malgun Gothic"/>
+          <w:b/>
+          <w:color w:val="5B21B6"/>
+          <w:sz w:val="26"/>
+        </w:rPr>
+        <w:t>설치 후 기억할 점</w:t>
+      </w:r>
+    </w:p>
+    <w:p>
+      <w:pPr>
+        <w:numPr>
+          <w:ilvl w:val="0"/>
+          <w:numId w:val="11"/>
+        </w:numPr>
+        <w:spacing w:after="80" w:line="300" w:lineRule="auto"/>
+      </w:pPr>
+      <w:r>
+        <w:rPr>
+          <w:rFonts w:ascii="Malgun Gothic" w:hAnsi="Malgun Gothic" w:eastAsia="Malgun Gothic"/>
+          <w:color w:val="21172E"/>
+        </w:rPr>
+        <w:t>설치해도 교사 권한과 PIN 보안은 그대로 유지됩니다.</w:t>
+      </w:r>
+    </w:p>
+    <w:p>
+      <w:pPr>
+        <w:numPr>
+          <w:ilvl w:val="0"/>
+          <w:numId w:val="11"/>
+        </w:numPr>
+        <w:spacing w:after="80" w:line="300" w:lineRule="auto"/>
+      </w:pPr>
+      <w:r>
+        <w:rPr>
+          <w:rFonts w:ascii="Malgun Gothic" w:hAnsi="Malgun Gothic" w:eastAsia="Malgun Gothic"/>
+          <w:color w:val="21172E"/>
+        </w:rPr>
+        <w:t>개인 기기에서는 자동 로그인을 사용하고, 다른 교사가 같은 기기를 쓸 때는 먼저 로그아웃합니다.</w:t>
+      </w:r>
+    </w:p>
+    <w:p>
+      <w:pPr>
+        <w:numPr>
+          <w:ilvl w:val="0"/>
+          <w:numId w:val="11"/>
+        </w:numPr>
+        <w:spacing w:after="80" w:line="300" w:lineRule="auto"/>
+      </w:pPr>
+      <w:r>
+        <w:rPr>
+          <w:rFonts w:ascii="Malgun Gothic" w:hAnsi="Malgun Gothic" w:eastAsia="Malgun Gothic"/>
+          <w:color w:val="21172E"/>
+        </w:rPr>
+        <w:t>새 버전 알림이 나타나면 출석 입력을 마친 뒤 업데이트를 누릅니다.</w:t>
+      </w:r>
+    </w:p>
+    <w:p>
+      <w:pPr>
+        <w:numPr>
+          <w:ilvl w:val="0"/>
+          <w:numId w:val="11"/>
+        </w:numPr>
+        <w:spacing w:after="80" w:line="300" w:lineRule="auto"/>
+      </w:pPr>
+      <w:r>
+        <w:rPr>
+          <w:rFonts w:ascii="Malgun Gothic" w:hAnsi="Malgun Gothic" w:eastAsia="Malgun Gothic"/>
+          <w:color w:val="21172E"/>
+        </w:rPr>
+        <w:t>인터넷이 끊기면 화면은 열릴 수 있어도 출석 저장은 되지 않으므로 연결 경고를 확인합니다.</w:t>
+      </w:r>
+    </w:p>
+    <w:p>
       <w:pPr>
         <w:spacing w:after="0" w:line="300" w:lineRule="auto"/>
         <w:jc w:val="left"/>
@@ -814,7 +1234,7 @@
           <w:rFonts w:ascii="Malgun Gothic" w:hAnsi="Malgun Gothic" w:eastAsia="Malgun Gothic"/>
           <w:color w:val="615A6B"/>
         </w:rPr>
-        <w:t xml:space="preserve">  |  크루교사 2장 · 보조교사 3장 · 임원 4~6장 · 보안·오류 7~8장 · 데스크톱·수정 9장</w:t>
+        <w:t xml:space="preserve">  |  크루교사 3장 · 보조교사 4장 · 임원 5~7장 · 보안·오류 8~9장 · 데스크톱·수정 10장</w:t>
       </w:r>
     </w:p>
     <w:p>
@@ -3750,7 +4170,7 @@
                 <w:color w:val="21172E"/>
                 <w:sz w:val="18"/>
               </w:rPr>
-              <w:t>브라우저 새로고침</w:t>
+              <w:t>새 버전 알림에서 업데이트</w:t>
             </w:r>
           </w:p>
         </w:tc>
@@ -3777,7 +4197,7 @@
                 <w:color w:val="21172E"/>
                 <w:sz w:val="18"/>
               </w:rPr>
-              <w:t>컴퓨터는 Ctrl+F5</w:t>
+              <w:t>없으면 새로고침 또는 Ctrl+F5</w:t>
             </w:r>
           </w:p>
         </w:tc>

</xml_diff>

<commit_message>
feat: add theme modes and approved app icons
</commit_message>
<xml_diff>
--- a/docs/새벽이슬_출석관리_사용설명서.docx
+++ b/docs/새벽이슬_출석관리_사용설명서.docx
@@ -1218,23 +1218,18 @@
     </w:p>
     <w:p>
       <w:pPr>
-        <w:spacing w:after="0" w:line="300" w:lineRule="auto"/>
-        <w:jc w:val="left"/>
+        <w:numPr>
+          <w:ilvl w:val="0"/>
+          <w:numId w:val="11"/>
+        </w:numPr>
+        <w:spacing w:after="80" w:line="300" w:lineRule="auto"/>
       </w:pPr>
       <w:r>
         <w:rPr>
           <w:rFonts w:ascii="Malgun Gothic" w:hAnsi="Malgun Gothic" w:eastAsia="Malgun Gothic"/>
-          <w:b/>
-          <w:color w:val="615A6B"/>
+          <w:color w:val="21172E"/>
         </w:rPr>
-        <w:t>빠른 찾기</w:t>
-      </w:r>
-      <w:r>
-        <w:rPr>
-          <w:rFonts w:ascii="Malgun Gothic" w:hAnsi="Malgun Gothic" w:eastAsia="Malgun Gothic"/>
-          <w:color w:val="615A6B"/>
-        </w:rPr>
-        <w:t xml:space="preserve">  |  크루교사 3장 · 보조교사 4장 · 임원 5~7장 · 보안·오류 8~9장 · 데스크톱·수정 10장</w:t>
+        <w:t>화면 모드 선택은 기기에 저장되며, 휴대폰은 보라색 십자가·체크, 컴퓨터는 모니터 아이콘으로 구분합니다.</w:t>
       </w:r>
     </w:p>
     <w:p>

</xml_diff>

<commit_message>
feat: add weekly reminders and grouped attendance details
</commit_message>
<xml_diff>
--- a/docs/새벽이슬_출석관리_사용설명서.docx
+++ b/docs/새벽이슬_출석관리_사용설명서.docx
@@ -1323,7 +1323,7 @@
           <w:rFonts w:ascii="Malgun Gothic" w:hAnsi="Malgun Gothic" w:eastAsia="Malgun Gothic"/>
           <w:color w:val="21172E"/>
         </w:rPr>
-        <w:t>PIN을 입력한 뒤 화면 상단의 날짜와 크루명을 확인합니다.</w:t>
+        <w:t>PIN을 입력한 뒤 자동 설정된 이번 주 주일 날짜와 크루명을 확인합니다.</w:t>
       </w:r>
     </w:p>
     <w:p>
@@ -1428,7 +1428,7 @@
                 <w:color w:val="B7791F"/>
                 <w:sz w:val="22"/>
               </w:rPr>
-              <w:t>저장 완료 확인</w:t>
+              <w:t>저장·PIN·휴대폰 알림</w:t>
             </w:r>
           </w:p>
           <w:p>
@@ -1441,7 +1441,7 @@
                 <w:color w:val="21172E"/>
                 <w:sz w:val="20"/>
               </w:rPr>
-              <w:t>학생별 표시가 저장 중에서 저장됨으로 바뀌었는지 확인합니다. 인터넷 연결 경고 또는 저장 실패가 보이면 저장된 것으로 판단하지 않습니다.</w:t>
+              <w:t>학생별 표시가 저장됨으로 바뀌었는지 확인합니다. 출석 화면 아래에서 현재 PIN 확인 후 내 PIN을 바꿀 수 있고, 알림 켜기를 누르면 임원의 독려 알림을 받을 수 있습니다.</w:t>
             </w:r>
           </w:p>
         </w:tc>
@@ -2417,7 +2417,23 @@
           <w:rFonts w:ascii="Malgun Gothic" w:hAnsi="Malgun Gothic" w:eastAsia="Malgun Gothic"/>
           <w:color w:val="21172E"/>
         </w:rPr>
-        <w:t>노란색 행과 확인 필요 표식이 있는 학생의 사유·연락·비고를 확인합니다.</w:t>
+        <w:t>크루별 접힌 제목에서 출석·결석·미체크 인원과 출석률을 보고 필요한 크루만 펼칩니다.</w:t>
+      </w:r>
+    </w:p>
+    <w:p>
+      <w:pPr>
+        <w:numPr>
+          <w:ilvl w:val="0"/>
+          <w:numId w:val="10"/>
+        </w:numPr>
+        <w:spacing w:after="80" w:line="300" w:lineRule="auto"/>
+      </w:pPr>
+      <w:r>
+        <w:rPr>
+          <w:rFonts w:ascii="Malgun Gothic" w:hAnsi="Malgun Gothic" w:eastAsia="Malgun Gothic"/>
+          <w:color w:val="21172E"/>
+        </w:rPr>
+        <w:t>노란색 행과 확인 필요 표식이 있는 학생의 사유·연락·비고를 확인합니다. 출석 학생의 결석 사유·연락 칸은 비워 표시됩니다.</w:t>
       </w:r>
     </w:p>
     <w:tbl>
@@ -2482,6 +2498,68 @@
         <w:spacing w:after="20"/>
       </w:pPr>
     </w:p>
+    <w:tbl>
+      <w:tblPr>
+        <w:tblW w:type="dxa" w:w="9360"/>
+        <w:jc w:val="left"/>
+        <w:tblLayout w:type="fixed"/>
+        <w:tblLook w:firstColumn="1" w:firstRow="1" w:lastColumn="0" w:lastRow="0" w:noHBand="0" w:noVBand="1" w:val="04A0"/>
+        <w:tblInd w:w="120" w:type="dxa"/>
+      </w:tblPr>
+      <w:tblGrid>
+        <w:gridCol w:w="9360"/>
+      </w:tblGrid>
+      <w:tr>
+        <w:trPr>
+          <w:tblHeader w:val="true"/>
+        </w:trPr>
+        <w:tc>
+          <w:tcPr>
+            <w:tcW w:type="dxa" w:w="9360"/>
+            <w:tcMar>
+              <w:top w:w="80" w:type="dxa"/>
+              <w:start w:w="120" w:type="dxa"/>
+              <w:bottom w:w="80" w:type="dxa"/>
+              <w:end w:w="120" w:type="dxa"/>
+            </w:tcMar>
+            <w:vAlign w:val="center"/>
+            <w:shd w:fill="F1EAFE"/>
+          </w:tcPr>
+          <w:p>
+            <w:pPr>
+              <w:spacing w:after="80"/>
+            </w:pPr>
+            <w:r>
+              <w:rPr>
+                <w:rFonts w:ascii="Malgun Gothic" w:hAnsi="Malgun Gothic" w:eastAsia="Malgun Gothic"/>
+                <w:b/>
+                <w:color w:val="5B21B6"/>
+                <w:sz w:val="22"/>
+              </w:rPr>
+              <w:t>출석 독려 알림</w:t>
+            </w:r>
+          </w:p>
+          <w:p>
+            <w:pPr>
+              <w:spacing w:after="0" w:line="288" w:lineRule="auto"/>
+            </w:pPr>
+            <w:r>
+              <w:rPr>
+                <w:rFonts w:ascii="Malgun Gothic" w:hAnsi="Malgun Gothic" w:eastAsia="Malgun Gothic"/>
+                <w:color w:val="21172E"/>
+                <w:sz w:val="20"/>
+              </w:rPr>
+              <w:t>전체 현황에서 아직 완료하지 않은 크루의 독려 알림 보내기를 누릅니다. 교사가 먼저 휴대폰 알림을 켜야 하며 같은 크루에는 30분에 한 번만 보낼 수 있습니다.</w:t>
+            </w:r>
+          </w:p>
+        </w:tc>
+      </w:tr>
+    </w:tbl>
+    <w:p>
+      <w:pPr>
+        <w:spacing w:after="20"/>
+      </w:pPr>
+    </w:p>
     <w:p>
       <w:pPr>
         <w:pStyle w:val="Heading2"/>
@@ -2587,11 +2665,6 @@
           <w:color w:val="21172E"/>
         </w:rPr>
         <w:t xml:space="preserve"> 출석일, 크루, 학생명, 학생상태, 출석상태, 체크자구분, 체크자명, 체크시각, 최종수정시각</w:t>
-      </w:r>
-    </w:p>
-    <w:p>
-      <w:r>
-        <w:br w:type="page"/>
       </w:r>
     </w:p>
     <w:p>
@@ -2887,11 +2960,6 @@
       <w:pPr>
         <w:spacing w:after="20"/>
       </w:pPr>
-    </w:p>
-    <w:p>
-      <w:r>
-        <w:br w:type="page"/>
-      </w:r>
     </w:p>
     <w:p>
       <w:pPr>
@@ -3454,6 +3522,62 @@
                 <w:sz w:val="18"/>
               </w:rPr>
               <w:t>임원교사가 교사 관리에서 새 PIN으로 초기화합니다.</w:t>
+            </w:r>
+          </w:p>
+        </w:tc>
+      </w:tr>
+      <w:tr>
+        <w:tc>
+          <w:tcPr>
+            <w:tcW w:type="dxa" w:w="2340"/>
+            <w:tcMar>
+              <w:top w:w="80" w:type="dxa"/>
+              <w:start w:w="120" w:type="dxa"/>
+              <w:bottom w:w="80" w:type="dxa"/>
+              <w:end w:w="120" w:type="dxa"/>
+            </w:tcMar>
+            <w:vAlign w:val="center"/>
+          </w:tcPr>
+          <w:p>
+            <w:pPr>
+              <w:spacing w:before="0" w:after="0" w:line="276" w:lineRule="auto"/>
+              <w:jc w:val="left"/>
+            </w:pPr>
+            <w:r>
+              <w:rPr>
+                <w:rFonts w:ascii="Malgun Gothic" w:hAnsi="Malgun Gothic" w:eastAsia="Malgun Gothic"/>
+                <w:b w:val="0"/>
+                <w:color w:val="21172E"/>
+                <w:sz w:val="18"/>
+              </w:rPr>
+              <w:t>PIN 변경</w:t>
+            </w:r>
+          </w:p>
+        </w:tc>
+        <w:tc>
+          <w:tcPr>
+            <w:tcW w:type="dxa" w:w="7020"/>
+            <w:tcMar>
+              <w:top w:w="80" w:type="dxa"/>
+              <w:start w:w="120" w:type="dxa"/>
+              <w:bottom w:w="80" w:type="dxa"/>
+              <w:end w:w="120" w:type="dxa"/>
+            </w:tcMar>
+            <w:vAlign w:val="center"/>
+          </w:tcPr>
+          <w:p>
+            <w:pPr>
+              <w:spacing w:before="0" w:after="0" w:line="276" w:lineRule="auto"/>
+              <w:jc w:val="left"/>
+            </w:pPr>
+            <w:r>
+              <w:rPr>
+                <w:rFonts w:ascii="Malgun Gothic" w:hAnsi="Malgun Gothic" w:eastAsia="Malgun Gothic"/>
+                <w:b w:val="0"/>
+                <w:color w:val="21172E"/>
+                <w:sz w:val="18"/>
+              </w:rPr>
+              <w:t>출석 화면의 내 PIN 변경에서 현재 PIN 확인 후 새 PIN을 정합니다.</w:t>
             </w:r>
           </w:p>
         </w:tc>

</xml_diff>

<commit_message>
feat: add first-time PIN setup and roster export
</commit_message>
<xml_diff>
--- a/docs/새벽이슬_출석관리_사용설명서.docx
+++ b/docs/새벽이슬_출석관리_사용설명서.docx
@@ -156,13 +156,9 @@
       </w:r>
     </w:p>
     <w:p>
-      <w:r>
-        <w:br w:type="page"/>
-      </w:r>
-    </w:p>
-    <w:p>
       <w:pPr>
         <w:pStyle w:val="Heading1"/>
+        <w:pageBreakBefore/>
       </w:pPr>
       <w:r>
         <w:rPr>
@@ -777,7 +773,7 @@
           <w:rFonts w:ascii="Malgun Gothic" w:hAnsi="Malgun Gothic" w:eastAsia="Malgun Gothic"/>
           <w:color w:val="21172E"/>
         </w:rPr>
-        <w:t>숫자 PIN 4~6자리를 입력하고 확인 표시를 누릅니다.</w:t>
+        <w:t>이름 옆에 처음 사용이 보이면 본인 휴대폰 번호 끝 4자리로 확인하고 새 PIN을 직접 정합니다. 이미 설정한 교사는 기존 PIN을 입력합니다.</w:t>
       </w:r>
     </w:p>
     <w:p>
@@ -796,14 +792,72 @@
         <w:t>개인 기기에서는 로그인이 최대 30일 유지됩니다. 공용 기기에서는 사용 후 반드시 로그아웃합니다.</w:t>
       </w:r>
     </w:p>
+    <w:tbl>
+      <w:tblPr>
+        <w:tblW w:type="dxa" w:w="9360"/>
+        <w:jc w:val="left"/>
+        <w:tblLayout w:type="fixed"/>
+        <w:tblLook w:firstColumn="1" w:firstRow="1" w:lastColumn="0" w:lastRow="0" w:noHBand="0" w:noVBand="1" w:val="04A0"/>
+        <w:tblInd w:w="120" w:type="dxa"/>
+      </w:tblPr>
+      <w:tblGrid>
+        <w:gridCol w:w="9360"/>
+      </w:tblGrid>
+      <w:tr>
+        <w:trPr>
+          <w:tblHeader w:val="true"/>
+        </w:trPr>
+        <w:tc>
+          <w:tcPr>
+            <w:tcW w:type="dxa" w:w="9360"/>
+            <w:tcMar>
+              <w:top w:w="80" w:type="dxa"/>
+              <w:start w:w="120" w:type="dxa"/>
+              <w:bottom w:w="80" w:type="dxa"/>
+              <w:end w:w="120" w:type="dxa"/>
+            </w:tcMar>
+            <w:vAlign w:val="center"/>
+            <w:shd w:fill="FFF8E6"/>
+          </w:tcPr>
+          <w:p>
+            <w:pPr>
+              <w:spacing w:after="80"/>
+            </w:pPr>
+            <w:r>
+              <w:rPr>
+                <w:rFonts w:ascii="Malgun Gothic" w:hAnsi="Malgun Gothic" w:eastAsia="Malgun Gothic"/>
+                <w:b/>
+                <w:color w:val="B7791F"/>
+                <w:sz w:val="22"/>
+              </w:rPr>
+              <w:t>처음 사용하는 교사</w:t>
+            </w:r>
+          </w:p>
+          <w:p>
+            <w:pPr>
+              <w:spacing w:after="0" w:line="288" w:lineRule="auto"/>
+            </w:pPr>
+            <w:r>
+              <w:rPr>
+                <w:rFonts w:ascii="Malgun Gothic" w:hAnsi="Malgun Gothic" w:eastAsia="Malgun Gothic"/>
+                <w:color w:val="21172E"/>
+                <w:sz w:val="20"/>
+              </w:rPr>
+              <w:t>교적부에 등록된 본인 휴대폰 번호 끝 4자리와 앞으로 사용할 숫자 PIN 4~6자리를 입력합니다. 휴대폰 번호 원문은 저장되지 않고, 확인을 5회 틀리면 10분간 잠깁니다.</w:t>
+            </w:r>
+          </w:p>
+        </w:tc>
+      </w:tr>
+    </w:tbl>
     <w:p>
-      <w:r>
-        <w:br w:type="page"/>
-      </w:r>
+      <w:pPr>
+        <w:spacing w:after="20"/>
+      </w:pPr>
     </w:p>
     <w:p>
       <w:pPr>
         <w:pStyle w:val="Heading2"/>
+        <w:pageBreakBefore/>
       </w:pPr>
       <w:r>
         <w:rPr>
@@ -1233,13 +1287,9 @@
       </w:r>
     </w:p>
     <w:p>
-      <w:r>
-        <w:br w:type="page"/>
-      </w:r>
-    </w:p>
-    <w:p>
       <w:pPr>
         <w:pStyle w:val="Heading1"/>
+        <w:pageBreakBefore/>
       </w:pPr>
       <w:r>
         <w:rPr>
@@ -1323,7 +1373,23 @@
           <w:rFonts w:ascii="Malgun Gothic" w:hAnsi="Malgun Gothic" w:eastAsia="Malgun Gothic"/>
           <w:color w:val="21172E"/>
         </w:rPr>
-        <w:t>PIN을 입력한 뒤 자동 설정된 이번 주 주일 날짜와 크루명을 확인합니다.</w:t>
+        <w:t>처음 사용 표시가 있으면 휴대폰 끝 4자리로 확인한 뒤 새 PIN을 두 번 입력합니다. 다음부터는 정한 PIN을 입력합니다.</w:t>
+      </w:r>
+    </w:p>
+    <w:p>
+      <w:pPr>
+        <w:numPr>
+          <w:ilvl w:val="0"/>
+          <w:numId w:val="10"/>
+        </w:numPr>
+        <w:spacing w:after="80" w:line="300" w:lineRule="auto"/>
+      </w:pPr>
+      <w:r>
+        <w:rPr>
+          <w:rFonts w:ascii="Malgun Gothic" w:hAnsi="Malgun Gothic" w:eastAsia="Malgun Gothic"/>
+          <w:color w:val="21172E"/>
+        </w:rPr>
+        <w:t>로그인 뒤 자동 설정된 이번 주 주일 날짜와 크루명을 확인합니다.</w:t>
       </w:r>
     </w:p>
     <w:p>
@@ -1511,28 +1577,7 @@
           <w:rFonts w:ascii="Malgun Gothic" w:hAnsi="Malgun Gothic" w:eastAsia="Malgun Gothic"/>
           <w:color w:val="21172E"/>
         </w:rPr>
-        <w:t>더 이상 크루에 속하지 않는 학생은 삭제하지 않고 퇴실로 처리합니다.</w:t>
-      </w:r>
-    </w:p>
-    <w:p>
-      <w:pPr>
-        <w:numPr>
-          <w:ilvl w:val="0"/>
-          <w:numId w:val="11"/>
-        </w:numPr>
-        <w:spacing w:after="80" w:line="300" w:lineRule="auto"/>
-      </w:pPr>
-      <w:r>
-        <w:rPr>
-          <w:rFonts w:ascii="Malgun Gothic" w:hAnsi="Malgun Gothic" w:eastAsia="Malgun Gothic"/>
-          <w:color w:val="21172E"/>
-        </w:rPr>
-        <w:t>학생 상태가 바뀌어도 과거 출석 기록은 그대로 유지됩니다.</w:t>
-      </w:r>
-    </w:p>
-    <w:p>
-      <w:r>
-        <w:br w:type="page"/>
+        <w:t>더 이상 크루에 속하지 않는 학생은 삭제하지 않고 퇴실로 처리합니다. 학생 상태가 바뀌어도 과거 출석 기록은 그대로 유지됩니다.</w:t>
       </w:r>
     </w:p>
     <w:p>
@@ -2295,13 +2340,9 @@
       </w:pPr>
     </w:p>
     <w:p>
-      <w:r>
-        <w:br w:type="page"/>
-      </w:r>
-    </w:p>
-    <w:p>
       <w:pPr>
         <w:pStyle w:val="Heading1"/>
+        <w:pageBreakBefore/>
       </w:pPr>
       <w:r>
         <w:rPr>
@@ -2636,14 +2677,14 @@
           <w:b/>
           <w:color w:val="21172E"/>
         </w:rPr>
-        <w:t>Excel용 표 복사:</w:t>
+        <w:t>교적부 XLSX:</w:t>
       </w:r>
       <w:r>
         <w:rPr>
           <w:rFonts w:ascii="Malgun Gothic" w:hAnsi="Malgun Gothic" w:eastAsia="Malgun Gothic"/>
           <w:color w:val="21172E"/>
         </w:rPr>
-        <w:t xml:space="preserve"> 버튼을 누른 뒤 Excel 첫 셀에 붙여넣습니다.</w:t>
+        <w:t xml:space="preserve"> 기존 교적부의 12개 열과 크루별 묶음·병합 형식으로 내려받는 실제 Excel 파일입니다. 프로그램에 없는 개인정보 열은 빈칸이고 출석 결과와 사유는 비고에 표시됩니다.</w:t>
       </w:r>
     </w:p>
     <w:p>
@@ -2770,7 +2811,23 @@
           <w:rFonts w:ascii="Malgun Gothic" w:hAnsi="Malgun Gothic" w:eastAsia="Malgun Gothic"/>
           <w:color w:val="21172E"/>
         </w:rPr>
-        <w:t>교사 이름, 처음 사용할 PIN, 담당교사 또는 임원교사 역할을 선택해 등록합니다.</w:t>
+        <w:t>2026 교적부에서 이관된 새 교사는 임원이 초기 PIN을 일일이 정하지 않습니다. 교사가 처음 접속할 때 본인 확인 후 직접 PIN을 정합니다.</w:t>
+      </w:r>
+    </w:p>
+    <w:p>
+      <w:pPr>
+        <w:numPr>
+          <w:ilvl w:val="0"/>
+          <w:numId w:val="10"/>
+        </w:numPr>
+        <w:spacing w:after="80" w:line="300" w:lineRule="auto"/>
+      </w:pPr>
+      <w:r>
+        <w:rPr>
+          <w:rFonts w:ascii="Malgun Gothic" w:hAnsi="Malgun Gothic" w:eastAsia="Malgun Gothic"/>
+          <w:color w:val="21172E"/>
+        </w:rPr>
+        <w:t>이후 화면에서 새 교사를 개별 등록할 때는 임시 PIN과 역할을 입력하고, 첫 로그인 후 교사가 내 PIN 변경을 사용하도록 안내합니다.</w:t>
       </w:r>
     </w:p>
     <w:p>
@@ -3190,28 +3247,7 @@
           <w:rFonts w:ascii="Malgun Gothic" w:hAnsi="Malgun Gothic" w:eastAsia="Malgun Gothic"/>
           <w:color w:val="21172E"/>
         </w:rPr>
-        <w:t>수정 담당자가 데모 화면과 테스트로 변경을 확인합니다.</w:t>
-      </w:r>
-    </w:p>
-    <w:p>
-      <w:pPr>
-        <w:numPr>
-          <w:ilvl w:val="0"/>
-          <w:numId w:val="10"/>
-        </w:numPr>
-        <w:spacing w:after="80" w:line="300" w:lineRule="auto"/>
-      </w:pPr>
-      <w:r>
-        <w:rPr>
-          <w:rFonts w:ascii="Malgun Gothic" w:hAnsi="Malgun Gothic" w:eastAsia="Malgun Gothic"/>
-          <w:color w:val="21172E"/>
-        </w:rPr>
-        <w:t>운영 배포 후 임원이 의견 상태를 완료로 변경합니다.</w:t>
-      </w:r>
-    </w:p>
-    <w:p>
-      <w:r>
-        <w:br w:type="page"/>
+        <w:t>수정 담당자가 데모 화면과 테스트로 변경을 확인하고 운영 배포하면, 임원이 의견 상태를 완료로 변경합니다.</w:t>
       </w:r>
     </w:p>
     <w:p>
@@ -3494,6 +3530,62 @@
                 <w:color w:val="21172E"/>
                 <w:sz w:val="18"/>
               </w:rPr>
+              <w:t>최초 본인 확인</w:t>
+            </w:r>
+          </w:p>
+        </w:tc>
+        <w:tc>
+          <w:tcPr>
+            <w:tcW w:type="dxa" w:w="7020"/>
+            <w:tcMar>
+              <w:top w:w="80" w:type="dxa"/>
+              <w:start w:w="120" w:type="dxa"/>
+              <w:bottom w:w="80" w:type="dxa"/>
+              <w:end w:w="120" w:type="dxa"/>
+            </w:tcMar>
+            <w:vAlign w:val="center"/>
+          </w:tcPr>
+          <w:p>
+            <w:pPr>
+              <w:spacing w:before="0" w:after="0" w:line="276" w:lineRule="auto"/>
+              <w:jc w:val="left"/>
+            </w:pPr>
+            <w:r>
+              <w:rPr>
+                <w:rFonts w:ascii="Malgun Gothic" w:hAnsi="Malgun Gothic" w:eastAsia="Malgun Gothic"/>
+                <w:b w:val="0"/>
+                <w:color w:val="21172E"/>
+                <w:sz w:val="18"/>
+              </w:rPr>
+              <w:t>본인 휴대폰 번호 끝 4자리로 한 번만 확인하고 PIN을 직접 정합니다.</w:t>
+            </w:r>
+          </w:p>
+        </w:tc>
+      </w:tr>
+      <w:tr>
+        <w:tc>
+          <w:tcPr>
+            <w:tcW w:type="dxa" w:w="2340"/>
+            <w:tcMar>
+              <w:top w:w="80" w:type="dxa"/>
+              <w:start w:w="120" w:type="dxa"/>
+              <w:bottom w:w="80" w:type="dxa"/>
+              <w:end w:w="120" w:type="dxa"/>
+            </w:tcMar>
+            <w:vAlign w:val="center"/>
+          </w:tcPr>
+          <w:p>
+            <w:pPr>
+              <w:spacing w:before="0" w:after="0" w:line="276" w:lineRule="auto"/>
+              <w:jc w:val="left"/>
+            </w:pPr>
+            <w:r>
+              <w:rPr>
+                <w:rFonts w:ascii="Malgun Gothic" w:hAnsi="Malgun Gothic" w:eastAsia="Malgun Gothic"/>
+                <w:b w:val="0"/>
+                <w:color w:val="21172E"/>
+                <w:sz w:val="18"/>
+              </w:rPr>
               <w:t>PIN 분실</w:t>
             </w:r>
           </w:p>
@@ -3773,7 +3865,7 @@
                 <w:color w:val="21172E"/>
                 <w:sz w:val="20"/>
               </w:rPr>
-              <w:t>현재 사용 중인 PIN과 비밀키는 이 설명서에 포함하지 않습니다. 초기 PIN 전달과 변경은 임원에게 별도로 확인합니다.</w:t>
+              <w:t>현재 사용 중인 PIN과 비밀키는 이 설명서에 포함하지 않습니다. 새 교사는 임원에게 초기 PIN을 전달받지 않고 처음 사용 화면에서 본인 확인 후 직접 정합니다.</w:t>
             </w:r>
           </w:p>
         </w:tc>
@@ -3785,13 +3877,9 @@
       </w:pPr>
     </w:p>
     <w:p>
-      <w:r>
-        <w:br w:type="page"/>
-      </w:r>
-    </w:p>
-    <w:p>
       <w:pPr>
         <w:pStyle w:val="Heading1"/>
+        <w:pageBreakBefore/>
       </w:pPr>
       <w:r>
         <w:rPr>
@@ -4179,6 +4267,89 @@
                 <w:color w:val="21172E"/>
                 <w:sz w:val="18"/>
               </w:rPr>
+              <w:t>처음 사용 확인 실패</w:t>
+            </w:r>
+          </w:p>
+        </w:tc>
+        <w:tc>
+          <w:tcPr>
+            <w:tcW w:type="dxa" w:w="3420"/>
+            <w:tcMar>
+              <w:top w:w="80" w:type="dxa"/>
+              <w:start w:w="120" w:type="dxa"/>
+              <w:bottom w:w="80" w:type="dxa"/>
+              <w:end w:w="120" w:type="dxa"/>
+            </w:tcMar>
+            <w:vAlign w:val="center"/>
+          </w:tcPr>
+          <w:p>
+            <w:pPr>
+              <w:spacing w:before="0" w:after="0" w:line="276" w:lineRule="auto"/>
+              <w:jc w:val="left"/>
+            </w:pPr>
+            <w:r>
+              <w:rPr>
+                <w:rFonts w:ascii="Malgun Gothic" w:hAnsi="Malgun Gothic" w:eastAsia="Malgun Gothic"/>
+                <w:b w:val="0"/>
+                <w:color w:val="21172E"/>
+                <w:sz w:val="18"/>
+              </w:rPr>
+              <w:t>교적부 휴대폰 끝 4자리 확인</w:t>
+            </w:r>
+          </w:p>
+        </w:tc>
+        <w:tc>
+          <w:tcPr>
+            <w:tcW w:type="dxa" w:w="3420"/>
+            <w:tcMar>
+              <w:top w:w="80" w:type="dxa"/>
+              <w:start w:w="120" w:type="dxa"/>
+              <w:bottom w:w="80" w:type="dxa"/>
+              <w:end w:w="120" w:type="dxa"/>
+            </w:tcMar>
+            <w:vAlign w:val="center"/>
+          </w:tcPr>
+          <w:p>
+            <w:pPr>
+              <w:spacing w:before="0" w:after="0" w:line="276" w:lineRule="auto"/>
+              <w:jc w:val="left"/>
+            </w:pPr>
+            <w:r>
+              <w:rPr>
+                <w:rFonts w:ascii="Malgun Gothic" w:hAnsi="Malgun Gothic" w:eastAsia="Malgun Gothic"/>
+                <w:b w:val="0"/>
+                <w:color w:val="21172E"/>
+                <w:sz w:val="18"/>
+              </w:rPr>
+              <w:t>계속 실패하면 임원에게 등록 정보 문의</w:t>
+            </w:r>
+          </w:p>
+        </w:tc>
+      </w:tr>
+      <w:tr>
+        <w:tc>
+          <w:tcPr>
+            <w:tcW w:type="dxa" w:w="2520"/>
+            <w:tcMar>
+              <w:top w:w="80" w:type="dxa"/>
+              <w:start w:w="120" w:type="dxa"/>
+              <w:bottom w:w="80" w:type="dxa"/>
+              <w:end w:w="120" w:type="dxa"/>
+            </w:tcMar>
+            <w:vAlign w:val="center"/>
+          </w:tcPr>
+          <w:p>
+            <w:pPr>
+              <w:spacing w:before="0" w:after="0" w:line="276" w:lineRule="auto"/>
+              <w:jc w:val="left"/>
+            </w:pPr>
+            <w:r>
+              <w:rPr>
+                <w:rFonts w:ascii="Malgun Gothic" w:hAnsi="Malgun Gothic" w:eastAsia="Malgun Gothic"/>
+                <w:b w:val="0"/>
+                <w:color w:val="21172E"/>
+                <w:sz w:val="18"/>
+              </w:rPr>
               <w:t>보조교사 이름 오류</w:t>
             </w:r>
           </w:p>
@@ -4567,13 +4738,9 @@
       </w:pPr>
     </w:p>
     <w:p>
-      <w:r>
-        <w:br w:type="page"/>
-      </w:r>
-    </w:p>
-    <w:p>
       <w:pPr>
         <w:pStyle w:val="Heading1"/>
+        <w:pageBreakBefore/>
       </w:pPr>
       <w:r>
         <w:rPr>
@@ -5075,13 +5242,9 @@
       </w:pPr>
     </w:p>
     <w:p>
-      <w:r>
-        <w:br w:type="page"/>
-      </w:r>
-    </w:p>
-    <w:p>
       <w:pPr>
         <w:pStyle w:val="Heading1"/>
+        <w:pageBreakBefore/>
       </w:pPr>
       <w:r>
         <w:rPr>
@@ -5310,7 +5473,7 @@
           <w:rFonts w:ascii="Malgun Gothic" w:hAnsi="Malgun Gothic" w:eastAsia="Malgun Gothic"/>
           <w:color w:val="21172E"/>
         </w:rPr>
-        <w:t>CSV 내보내기와 기존 출석 건수의 이상 여부</w:t>
+        <w:t>CSV와 교적부 XLSX 내보내기, 기존 출석 건수의 이상 여부</w:t>
       </w:r>
     </w:p>
     <w:tbl>

</xml_diff>